<commit_message>
Model confidence and database connection
</commit_message>
<xml_diff>
--- a/FXGuard_AI_Technical_Report_converted.docx
+++ b/FXGuard_AI_Technical_Report_converted.docx
@@ -33,11 +33,9 @@
           <w:color w:val="5A6460"/>
           <w:sz w:val="26"/>
         </w:rPr>
-        <w:t>USD/RWF exchange-rate risk forecasting and decision-support prototype</w:t>
-      </w:r>
-      <w:r>
-        <w:t xml:space="preserve"> </w:t>
-      </w:r>
+        <w:t>Multicurrency exchange-rate risk forecasting and decision-support prototype</w:t>
+      </w:r>
+      <w:r/>
     </w:p>
     <w:p>
       <w:pPr>
@@ -96,15 +94,6 @@
               <w:t xml:space="preserve"> </w:t>
             </w:r>
           </w:p>
-          <w:p>
-            <w:pPr>
-              <w:spacing w:after="0" w:line="259" w:lineRule="auto"/>
-              <w:ind w:left="0" w:firstLine="0"/>
-            </w:pPr>
-            <w:r>
-              <w:t xml:space="preserve"> </w:t>
-            </w:r>
-          </w:p>
         </w:tc>
       </w:tr>
     </w:tbl>
@@ -132,25 +121,19 @@
         <w:ind w:left="-5"/>
       </w:pPr>
       <w:r>
-        <w:t xml:space="preserve">Many importers in </w:t>
-      </w:r>
-      <w:r>
-        <w:t>Rwanda earn revenue in Rwandan francs but pay international suppliers in U.S. dollars. When the Rwandan franc weakens before the supplier payment date, the same USD invoice becomes more expensive in RWF. FXGuard AI addresses this problem by converting hist</w:t>
-      </w:r>
-      <w:r>
-        <w:t xml:space="preserve">orical exchange-rate behavior into an interpretable risk classification. </w:t>
-      </w:r>
+        <w:t>Many importers in Rwanda earn revenue in Rwandan francs but pay international suppliers in foreign currencies. When the Rwandan franc weakens before a supplier payment date, the same invoice becomes more expensive in RWF. FXGuard AI addresses this problem by converting historical exchange-rate behaviour into an interpretable risk classification.</w:t>
+      </w:r>
+      <w:r/>
+      <w:r/>
     </w:p>
     <w:p>
       <w:pPr>
         <w:ind w:left="-5"/>
       </w:pPr>
       <w:r>
-        <w:t>FXGuard AI is a web-based decision-support prototype for Rwanda-based importers. It uses official USD/RWF exchange-rate data, engineered time-series features, and classification mode</w:t>
-      </w:r>
-      <w:r>
-        <w:t xml:space="preserve">ls to estimate whether a USD supplier payment faces Low, Medium, or High depreciation risk over a 7-day or 14-day horizon. </w:t>
-      </w:r>
+        <w:t>FXGuard AI is a web-based decision-support prototype for Rwanda-based importers. It uses official USD/RWF, EUR/RWF, and KES/RWF exchange-rate history, engineered time-series features, and separate classifiers to estimate Low, Medium, or High depreciation risk over a 7-day or 14-day horizon.</w:t>
+      </w:r>
+      <w:r/>
     </w:p>
     <w:tbl>
       <w:tblPr>
@@ -196,9 +179,7 @@
               </w:rPr>
               <w:t>Detail</w:t>
             </w:r>
-            <w:r>
-              <w:t xml:space="preserve"> </w:t>
-            </w:r>
+            <w:r/>
           </w:p>
         </w:tc>
         <w:tc>
@@ -224,9 +205,7 @@
               </w:rPr>
               <w:t>Description</w:t>
             </w:r>
-            <w:r>
-              <w:t xml:space="preserve"> </w:t>
-            </w:r>
+            <w:r/>
           </w:p>
         </w:tc>
       </w:tr>
@@ -256,9 +235,7 @@
               </w:rPr>
               <w:t>Problem</w:t>
             </w:r>
-            <w:r>
-              <w:t xml:space="preserve"> </w:t>
-            </w:r>
+            <w:r/>
           </w:p>
         </w:tc>
         <w:tc>
@@ -280,17 +257,14 @@
               <w:rPr>
                 <w:sz w:val="18"/>
               </w:rPr>
-              <w:t>Short-term USD/RWF movements can increase import costs, reduce margins, and create payment planning u</w:t>
-            </w:r>
-            <w:r>
-              <w:rPr>
-                <w:sz w:val="18"/>
-              </w:rPr>
-              <w:t>ncertainty.</w:t>
-            </w:r>
-            <w:r>
-              <w:t xml:space="preserve"> </w:t>
-            </w:r>
+              <w:t>Short-term USD/RWF, EUR/RWF, and KES/RWF movements can increase import costs, reduce margins, and create payment-planning uncertainty.</w:t>
+            </w:r>
+            <w:r>
+              <w:rPr>
+                <w:sz w:val="18"/>
+              </w:rPr>
+            </w:r>
+            <w:r/>
           </w:p>
         </w:tc>
       </w:tr>
@@ -320,9 +294,7 @@
               </w:rPr>
               <w:t>Goal</w:t>
             </w:r>
-            <w:r>
-              <w:t xml:space="preserve"> </w:t>
-            </w:r>
+            <w:r/>
           </w:p>
         </w:tc>
         <w:tc>
@@ -344,11 +316,9 @@
               <w:rPr>
                 <w:sz w:val="18"/>
               </w:rPr>
-              <w:t>Classify short-term USD/RWF depreciation risk as Low, Medium, or High.</w:t>
-            </w:r>
-            <w:r>
-              <w:t xml:space="preserve"> </w:t>
-            </w:r>
+              <w:t>Classify short-term RWF depreciation risk as Low, Medium, or High for each supported supplier-payment currency.</w:t>
+            </w:r>
+            <w:r/>
           </w:p>
         </w:tc>
       </w:tr>
@@ -378,9 +348,7 @@
               </w:rPr>
               <w:t>Users</w:t>
             </w:r>
-            <w:r>
-              <w:t xml:space="preserve"> </w:t>
-            </w:r>
+            <w:r/>
           </w:p>
         </w:tc>
         <w:tc>
@@ -404,9 +372,7 @@
               </w:rPr>
               <w:t>Rwanda-based importers, small business owners, accountants, and finance professionals.</w:t>
             </w:r>
-            <w:r>
-              <w:t xml:space="preserve"> </w:t>
-            </w:r>
+            <w:r/>
           </w:p>
         </w:tc>
       </w:tr>
@@ -434,11 +400,9 @@
               <w:rPr>
                 <w:sz w:val="18"/>
               </w:rPr>
-              <w:t>MVP scope</w:t>
-            </w:r>
-            <w:r>
-              <w:t xml:space="preserve"> </w:t>
-            </w:r>
+              <w:t>Current scope</w:t>
+            </w:r>
+            <w:r/>
           </w:p>
         </w:tc>
         <w:tc>
@@ -460,17 +424,14 @@
               <w:rPr>
                 <w:sz w:val="18"/>
               </w:rPr>
-              <w:t>USD/RWF only, 4-year daily BNR dataset, 7-day and 14-day</w:t>
-            </w:r>
-            <w:r>
-              <w:rPr>
-                <w:sz w:val="18"/>
-              </w:rPr>
-              <w:t xml:space="preserve"> prediction horizons, FastAPI backend, web frontend.</w:t>
-            </w:r>
-            <w:r>
-              <w:t xml:space="preserve"> </w:t>
-            </w:r>
+              <w:t>USD, EUR, and KES against RWF; official BNR history; 7-day and 14-day horizons; FastAPI backend; web frontend.</w:t>
+            </w:r>
+            <w:r>
+              <w:rPr>
+                <w:sz w:val="18"/>
+              </w:rPr>
+            </w:r>
+            <w:r/>
           </w:p>
         </w:tc>
       </w:tr>
@@ -500,9 +461,7 @@
               </w:rPr>
               <w:t>Output</w:t>
             </w:r>
-            <w:r>
-              <w:t xml:space="preserve"> </w:t>
-            </w:r>
+            <w:r/>
           </w:p>
         </w:tc>
         <w:tc>
@@ -524,11 +483,9 @@
               <w:rPr>
                 <w:sz w:val="18"/>
               </w:rPr>
-              <w:t>Risk class, probability distribution, confidence score, current RWF cost, possible extra cost, key drivers, and recommendations.</w:t>
-            </w:r>
-            <w:r>
-              <w:t xml:space="preserve"> </w:t>
-            </w:r>
+              <w:t>Risk class, probability distribution, model-confidence score, current RWF cost, possible extra cost, key drivers, and recommendations.</w:t>
+            </w:r>
+            <w:r/>
           </w:p>
         </w:tc>
       </w:tr>
@@ -556,11 +513,9 @@
         <w:ind w:left="-5"/>
       </w:pPr>
       <w:r>
-        <w:t>The dataset used in the MVP is a prepared officia</w:t>
-      </w:r>
-      <w:r>
-        <w:t xml:space="preserve">l BNR USD/RWF exchange-rate export. The prototype focuses on USD/RWF because USD is widely used in international supplier payments and the available dataset supports a complete first version. </w:t>
-      </w:r>
+        <w:t>The current multicurrency dataset was prepared from official National Bank of Rwanda exchange-rate exports for USD, EUR, and KES. Each currency has a continuous daily calendar, engineered features, future risk labels, and separate 7-day and 14-day model-ready datasets.</w:t>
+      </w:r>
+      <w:r/>
     </w:p>
     <w:tbl>
       <w:tblPr>
@@ -606,9 +561,7 @@
               </w:rPr>
               <w:t>Item</w:t>
             </w:r>
-            <w:r>
-              <w:t xml:space="preserve"> </w:t>
-            </w:r>
+            <w:r/>
           </w:p>
         </w:tc>
         <w:tc>
@@ -634,9 +587,7 @@
               </w:rPr>
               <w:t>Description</w:t>
             </w:r>
-            <w:r>
-              <w:t xml:space="preserve"> </w:t>
-            </w:r>
+            <w:r/>
           </w:p>
         </w:tc>
       </w:tr>
@@ -666,9 +617,7 @@
               </w:rPr>
               <w:t>Source</w:t>
             </w:r>
-            <w:r>
-              <w:t xml:space="preserve"> </w:t>
-            </w:r>
+            <w:r/>
           </w:p>
         </w:tc>
         <w:tc>
@@ -690,17 +639,14 @@
               <w:rPr>
                 <w:sz w:val="18"/>
               </w:rPr>
-              <w:t xml:space="preserve">BNR USD/RWF exchange-rate export </w:t>
-            </w:r>
-            <w:r>
-              <w:rPr>
-                <w:sz w:val="18"/>
-              </w:rPr>
-              <w:t>prepared for the project.</w:t>
-            </w:r>
-            <w:r>
-              <w:t xml:space="preserve"> </w:t>
-            </w:r>
+              <w:t>Official National Bank of Rwanda Excel exchange-rate exports.</w:t>
+            </w:r>
+            <w:r>
+              <w:rPr>
+                <w:sz w:val="18"/>
+              </w:rPr>
+            </w:r>
+            <w:r/>
           </w:p>
         </w:tc>
       </w:tr>
@@ -727,11 +673,9 @@
               <w:rPr>
                 <w:sz w:val="18"/>
               </w:rPr>
-              <w:t>Currency pair</w:t>
-            </w:r>
-            <w:r>
-              <w:t xml:space="preserve"> </w:t>
-            </w:r>
+              <w:t>Currency pairs</w:t>
+            </w:r>
+            <w:r/>
           </w:p>
         </w:tc>
         <w:tc>
@@ -753,11 +697,9 @@
               <w:rPr>
                 <w:sz w:val="18"/>
               </w:rPr>
-              <w:t>USD/RWF.</w:t>
-            </w:r>
-            <w:r>
-              <w:t xml:space="preserve"> </w:t>
-            </w:r>
+              <w:t>USD/RWF, EUR/RWF, and KES/RWF.</w:t>
+            </w:r>
+            <w:r/>
           </w:p>
         </w:tc>
       </w:tr>
@@ -785,12 +727,9 @@
               <w:rPr>
                 <w:sz w:val="18"/>
               </w:rPr>
-              <w:lastRenderedPageBreak/>
               <w:t>Period</w:t>
             </w:r>
-            <w:r>
-              <w:t xml:space="preserve"> </w:t>
-            </w:r>
+            <w:r/>
           </w:p>
         </w:tc>
         <w:tc>
@@ -812,11 +751,9 @@
               <w:rPr>
                 <w:sz w:val="18"/>
               </w:rPr>
-              <w:t>Approximately four years of daily exchange-rate observations, prepared from 2022-01-01 to 2026-06-25 in the presentation version.</w:t>
-            </w:r>
-            <w:r>
-              <w:t xml:space="preserve"> </w:t>
-            </w:r>
+              <w:t>Official observations from 4 January 2022 to 17 July 2026; model-ready dates vary slightly by forecast horizon.</w:t>
+            </w:r>
+            <w:r/>
           </w:p>
         </w:tc>
       </w:tr>
@@ -845,9 +782,7 @@
               </w:rPr>
               <w:t>Raw fields</w:t>
             </w:r>
-            <w:r>
-              <w:t xml:space="preserve"> </w:t>
-            </w:r>
+            <w:r/>
           </w:p>
         </w:tc>
         <w:tc>
@@ -869,11 +804,9 @@
               <w:rPr>
                 <w:sz w:val="18"/>
               </w:rPr>
-              <w:t>date, buying_rate, selling_rate.</w:t>
-            </w:r>
-            <w:r>
-              <w:t xml:space="preserve"> </w:t>
-            </w:r>
+              <w:t>date, currency, buying_rate, average_rate, selling_rate, source, and rate type.</w:t>
+            </w:r>
+            <w:r/>
           </w:p>
         </w:tc>
       </w:tr>
@@ -903,9 +836,7 @@
               </w:rPr>
               <w:t>Prepared fields</w:t>
             </w:r>
-            <w:r>
-              <w:t xml:space="preserve"> </w:t>
-            </w:r>
+            <w:r/>
           </w:p>
         </w:tc>
         <w:tc>
@@ -927,11 +858,9 @@
               <w:rPr>
                 <w:sz w:val="18"/>
               </w:rPr>
-              <w:t>daily calendar, mid_rate, engineered features, 7-day labels, and 14-day labels.</w:t>
-            </w:r>
-            <w:r>
-              <w:t xml:space="preserve"> </w:t>
-            </w:r>
+              <w:t>Daily calendar, mid-rate, engineered features, and currency-specific 7-day and 14-day labels.</w:t>
+            </w:r>
+            <w:r/>
           </w:p>
         </w:tc>
       </w:tr>
@@ -961,9 +890,7 @@
               </w:rPr>
               <w:t>Daily calendar approach</w:t>
             </w:r>
-            <w:r>
-              <w:t xml:space="preserve"> </w:t>
-            </w:r>
+            <w:r/>
           </w:p>
         </w:tc>
         <w:tc>
@@ -985,11 +912,9 @@
               <w:rPr>
                 <w:sz w:val="18"/>
               </w:rPr>
-              <w:t>Missing non-posting days were handled using forward-fill to create a continuous daily time series.</w:t>
-            </w:r>
-            <w:r>
-              <w:t xml:space="preserve"> </w:t>
-            </w:r>
+              <w:t>Missing non-posting days were forward-filled within each currency's own history; no values were created before its first official observation.</w:t>
+            </w:r>
+            <w:r/>
           </w:p>
         </w:tc>
       </w:tr>
@@ -1279,11 +1204,9 @@
         <w:ind w:left="-5"/>
       </w:pPr>
       <w:r>
-        <w:t>The labels are created by looking ahead in the historical dataset. For a 7-day label,</w:t>
-      </w:r>
-      <w:r>
-        <w:t xml:space="preserve"> the system compares today's mid_rate to the mid_rate seven days later. For a 14-day label, it compares today's mid_rate to the mid_rate fourteen days later. The resulting future depreciation is converted into Low, Medium, or High risk. </w:t>
-      </w:r>
+        <w:t>Labels are created by looking ahead within each currency's historical series. A 7-day label compares the current mid-rate with the rate seven days later; a 14-day label uses fourteen days later. The resulting RWF depreciation is converted into Low, Medium, or High risk using currency-specific thresholds.</w:t>
+      </w:r>
+      <w:r/>
     </w:p>
     <w:p>
       <w:pPr>
@@ -2162,11 +2085,9 @@
               <w:rPr>
                 <w:sz w:val="18"/>
               </w:rPr>
-              <w:t>Number of recent days where USD/RWF increased</w:t>
-            </w:r>
-            <w:r>
-              <w:t xml:space="preserve"> </w:t>
-            </w:r>
+              <w:t>Number of recent days when the selected foreign-currency/RWF rate increased</w:t>
+            </w:r>
+            <w:r/>
           </w:p>
         </w:tc>
         <w:tc>
@@ -2188,17 +2109,14 @@
               <w:rPr>
                 <w:sz w:val="18"/>
               </w:rPr>
-              <w:t xml:space="preserve">Shows how </w:t>
-            </w:r>
-            <w:r>
-              <w:rPr>
-                <w:sz w:val="18"/>
-              </w:rPr>
-              <w:t>persistent weakening pressure has been.</w:t>
-            </w:r>
-            <w:r>
-              <w:t xml:space="preserve"> </w:t>
-            </w:r>
+              <w:t>Shows how persistent recent RWF weakening pressure has been for the selected currency.</w:t>
+            </w:r>
+            <w:r>
+              <w:rPr>
+                <w:sz w:val="18"/>
+              </w:rPr>
+            </w:r>
+            <w:r/>
           </w:p>
         </w:tc>
       </w:tr>
@@ -2262,18 +2180,15 @@
                 <w:b/>
                 <w:sz w:val="18"/>
               </w:rPr>
-              <w:t xml:space="preserve">Function / </w:t>
+              <w:t>Function / endpoint</w:t>
             </w:r>
             <w:r>
               <w:rPr>
                 <w:b/>
                 <w:sz w:val="18"/>
               </w:rPr>
-              <w:t>endpoint</w:t>
-            </w:r>
-            <w:r>
-              <w:t xml:space="preserve"> </w:t>
-            </w:r>
+            </w:r>
+            <w:r/>
           </w:p>
         </w:tc>
         <w:tc>
@@ -2299,9 +2214,7 @@
               </w:rPr>
               <w:t>Role in the prototype</w:t>
             </w:r>
-            <w:r>
-              <w:t xml:space="preserve"> </w:t>
-            </w:r>
+            <w:r/>
           </w:p>
         </w:tc>
       </w:tr>
@@ -2331,9 +2244,7 @@
               </w:rPr>
               <w:t>load_daily_calendar()</w:t>
             </w:r>
-            <w:r>
-              <w:t xml:space="preserve"> </w:t>
-            </w:r>
+            <w:r/>
           </w:p>
         </w:tc>
         <w:tc>
@@ -2355,11 +2266,9 @@
               <w:rPr>
                 <w:sz w:val="18"/>
               </w:rPr>
-              <w:t>Loads the prepared daily USD/RWF exchange-rate series.</w:t>
-            </w:r>
-            <w:r>
-              <w:t xml:space="preserve"> </w:t>
-            </w:r>
+              <w:t>Loads the prepared daily exchange-rate series for the selected currency.</w:t>
+            </w:r>
+            <w:r/>
           </w:p>
         </w:tc>
       </w:tr>
@@ -2389,9 +2298,7 @@
               </w:rPr>
               <w:t>load_features()</w:t>
             </w:r>
-            <w:r>
-              <w:t xml:space="preserve"> </w:t>
-            </w:r>
+            <w:r/>
           </w:p>
         </w:tc>
         <w:tc>
@@ -2413,11 +2320,9 @@
               <w:rPr>
                 <w:sz w:val="18"/>
               </w:rPr>
-              <w:t>Loads the engineered model-ready feature dataset.</w:t>
-            </w:r>
-            <w:r>
-              <w:t xml:space="preserve"> </w:t>
-            </w:r>
+              <w:t>Loads the engineered multicurrency model-ready feature dataset.</w:t>
+            </w:r>
+            <w:r/>
           </w:p>
         </w:tc>
       </w:tr>
@@ -2447,9 +2352,7 @@
               </w:rPr>
               <w:t>model_predict()</w:t>
             </w:r>
-            <w:r>
-              <w:t xml:space="preserve"> </w:t>
-            </w:r>
+            <w:r/>
           </w:p>
         </w:tc>
         <w:tc>
@@ -2471,17 +2374,14 @@
               <w:rPr>
                 <w:sz w:val="18"/>
               </w:rPr>
-              <w:t xml:space="preserve">Loads the trained model for the selected horizon and </w:t>
-            </w:r>
-            <w:r>
-              <w:rPr>
-                <w:sz w:val="18"/>
-              </w:rPr>
-              <w:t>returns the predicted class and class probabilities.</w:t>
-            </w:r>
-            <w:r>
-              <w:t xml:space="preserve"> </w:t>
-            </w:r>
+              <w:t>Loads the currency- and horizon-specific model and returns a risk class and probabilities.</w:t>
+            </w:r>
+            <w:r>
+              <w:rPr>
+                <w:sz w:val="18"/>
+              </w:rPr>
+            </w:r>
+            <w:r/>
           </w:p>
         </w:tc>
       </w:tr>
@@ -2511,9 +2411,7 @@
               </w:rPr>
               <w:t>/api/latest-rate</w:t>
             </w:r>
-            <w:r>
-              <w:t xml:space="preserve"> </w:t>
-            </w:r>
+            <w:r/>
           </w:p>
         </w:tc>
         <w:tc>
@@ -2535,11 +2433,9 @@
               <w:rPr>
                 <w:sz w:val="18"/>
               </w:rPr>
-              <w:t>Returns the latest available USD/RWF exchange rate.</w:t>
-            </w:r>
-            <w:r>
-              <w:t xml:space="preserve"> </w:t>
-            </w:r>
+              <w:t>Returns the latest official exchange rate for USD, EUR, or KES against RWF.</w:t>
+            </w:r>
+            <w:r/>
           </w:p>
         </w:tc>
       </w:tr>
@@ -2569,9 +2465,7 @@
               </w:rPr>
               <w:t>/api/data-freshness</w:t>
             </w:r>
-            <w:r>
-              <w:t xml:space="preserve"> </w:t>
-            </w:r>
+            <w:r/>
           </w:p>
         </w:tc>
         <w:tc>
@@ -2593,11 +2487,9 @@
               <w:rPr>
                 <w:sz w:val="18"/>
               </w:rPr>
-              <w:t>Reports how old the local dataset is, supporting transparency and retraining decisions.</w:t>
-            </w:r>
-            <w:r>
-              <w:t xml:space="preserve"> </w:t>
-            </w:r>
+              <w:t>Reports the latest imported official date and data age for a selected currency.</w:t>
+            </w:r>
+            <w:r/>
           </w:p>
         </w:tc>
       </w:tr>
@@ -2627,9 +2519,7 @@
               </w:rPr>
               <w:t>/api/predict-risk</w:t>
             </w:r>
-            <w:r>
-              <w:t xml:space="preserve"> </w:t>
-            </w:r>
+            <w:r/>
           </w:p>
         </w:tc>
         <w:tc>
@@ -2651,11 +2541,9 @@
               <w:rPr>
                 <w:sz w:val="18"/>
               </w:rPr>
-              <w:t>Receives user amount and horizon, then returns risk class, confidence, cost estimate, key drivers, and recommendations.</w:t>
-            </w:r>
-            <w:r>
-              <w:t xml:space="preserve"> </w:t>
-            </w:r>
+              <w:t>Receives currency, amount, and horizon and returns risk, likelihood scores, cost estimates, drivers, and recommendations.</w:t>
+            </w:r>
+            <w:r/>
           </w:p>
         </w:tc>
       </w:tr>
@@ -2683,11 +2571,9 @@
               <w:rPr>
                 <w:sz w:val="18"/>
               </w:rPr>
-              <w:t>/feedback</w:t>
-            </w:r>
-            <w:r>
-              <w:t xml:space="preserve"> </w:t>
-            </w:r>
+              <w:t>/api/feedback</w:t>
+            </w:r>
+            <w:r/>
           </w:p>
         </w:tc>
         <w:tc>
@@ -2709,11 +2595,9 @@
               <w:rPr>
                 <w:sz w:val="18"/>
               </w:rPr>
-              <w:t>Saves participant usability feedback for evaluation.</w:t>
-            </w:r>
-            <w:r>
-              <w:t xml:space="preserve"> </w:t>
-            </w:r>
+              <w:t>Provides the local participant-feedback backup endpoint.</w:t>
+            </w:r>
+            <w:r/>
           </w:p>
         </w:tc>
       </w:tr>
@@ -2746,11 +2630,60 @@
         <w:ind w:left="-5"/>
       </w:pPr>
       <w:r>
-        <w:t xml:space="preserve">Three classification models were </w:t>
-      </w:r>
-      <w:r>
-        <w:t xml:space="preserve">trained and compared for both the 7-day and 14-day horizons: Logistic Regression, Random Forest, and XGBoost. The goal was to compare a simple interpretable model with more complex tree-based models. </w:t>
-      </w:r>
+        <w:t>Logistic Regression, Random Forest, and XGBoost were compared independently for USD, EUR, and KES over both 7-day and 14-day horizons. Model selection was based on time-aware historical backtesting rather than the final holdout.</w:t>
+      </w:r>
+      <w:r/>
+    </w:p>
+    <w:p>
+      <w:pPr>
+        <w:spacing w:after="136"/>
+        <w:ind w:left="-5"/>
+      </w:pPr>
+      <w:r>
+        <w:t>Accuracy reports the overall share classified correctly. Balanced Accuracy gives equal importance to Low, Medium, and High risk, while Macro F1 combines precision and recall with equal weight for each class. Balanced Accuracy was the primary model-selection measure because risk classes were not evenly distributed in every historical period.</w:t>
+      </w:r>
+      <w:r/>
+      <w:r/>
+    </w:p>
+    <w:p>
+      <w:pPr>
+        <w:pStyle w:val="Heading2"/>
+      </w:pPr>
+      <w:r>
+        <w:t>Multicurrency Backtesting Method</w:t>
+      </w:r>
+      <w:r>
+        <w:rPr>
+          <w:b w:val="0"/>
+          <w:color w:val="000000"/>
+          <w:sz w:val="22"/>
+        </w:rPr>
+      </w:r>
+    </w:p>
+    <w:p>
+      <w:pPr>
+        <w:pBdr>
+          <w:top w:val="single" w:sz="8" w:space="0" w:color="DADCE0"/>
+          <w:left w:val="single" w:sz="8" w:space="0" w:color="DADCE0"/>
+          <w:bottom w:val="single" w:sz="8" w:space="0" w:color="DADCE0"/>
+          <w:right w:val="single" w:sz="8" w:space="0" w:color="DADCE0"/>
+        </w:pBdr>
+        <w:shd w:val="clear" w:color="auto" w:fill="F4F6F9"/>
+        <w:spacing w:after="94"/>
+        <w:ind w:left="120" w:firstLine="0"/>
+      </w:pPr>
+      <w:r>
+        <w:rPr>
+          <w:sz w:val="20"/>
+        </w:rPr>
+        <w:t>Three expanding-window rolling-origin folds were used for every currency and horizon. In each fold, the model learned from an earlier period and was tested on the following 10% of observations. All folds stayed within the first 80% of the timeline, while the final 20% remained excluded from model selection. A 7-row or 14-row purge gap separated training and testing so labels derived from future rates could not cross the boundary. After selection and holdout evaluation, the winning production model was refitted on all labeled history.</w:t>
+      </w:r>
+      <w:r>
+        <w:rPr>
+          <w:sz w:val="20"/>
+        </w:rPr>
+      </w:r>
+      <w:r/>
     </w:p>
     <w:tbl>
       <w:tblPr>
@@ -2800,11 +2733,9 @@
                 <w:b/>
                 <w:sz w:val="18"/>
               </w:rPr>
-              <w:t>Horizon</w:t>
-            </w:r>
-            <w:r>
-              <w:t xml:space="preserve"> </w:t>
-            </w:r>
+              <w:t>Currency</w:t>
+            </w:r>
+            <w:r/>
           </w:p>
         </w:tc>
         <w:tc>
@@ -2829,11 +2760,9 @@
                 <w:b/>
                 <w:sz w:val="18"/>
               </w:rPr>
-              <w:t>Model</w:t>
-            </w:r>
-            <w:r>
-              <w:t xml:space="preserve"> </w:t>
-            </w:r>
+              <w:t>Horizon</w:t>
+            </w:r>
+            <w:r/>
           </w:p>
         </w:tc>
         <w:tc>
@@ -2858,11 +2787,9 @@
                 <w:b/>
                 <w:sz w:val="18"/>
               </w:rPr>
-              <w:t>Accuracy</w:t>
-            </w:r>
-            <w:r>
-              <w:t xml:space="preserve"> </w:t>
-            </w:r>
+              <w:t>Selected model</w:t>
+            </w:r>
+            <w:r/>
           </w:p>
         </w:tc>
         <w:tc>
@@ -2886,11 +2813,9 @@
                 <w:b/>
                 <w:sz w:val="18"/>
               </w:rPr>
-              <w:t>Balanced Accuracy</w:t>
-            </w:r>
-            <w:r>
-              <w:t xml:space="preserve"> </w:t>
-            </w:r>
+              <w:t>Backtest accuracy</w:t>
+            </w:r>
+            <w:r/>
           </w:p>
         </w:tc>
         <w:tc>
@@ -2915,11 +2840,9 @@
                 <w:b/>
                 <w:sz w:val="18"/>
               </w:rPr>
-              <w:t>Macro F1</w:t>
-            </w:r>
-            <w:r>
-              <w:t xml:space="preserve"> </w:t>
-            </w:r>
+              <w:t>Balanced accuracy</w:t>
+            </w:r>
+            <w:r/>
           </w:p>
         </w:tc>
         <w:tc>
@@ -2944,11 +2867,9 @@
                 <w:b/>
                 <w:sz w:val="18"/>
               </w:rPr>
-              <w:t>Log Loss</w:t>
-            </w:r>
-            <w:r>
-              <w:t xml:space="preserve"> </w:t>
-            </w:r>
+              <w:t>Macro F1</w:t>
+            </w:r>
+            <w:r/>
           </w:p>
         </w:tc>
         <w:tc>
@@ -2973,11 +2894,9 @@
                 <w:b/>
                 <w:sz w:val="18"/>
               </w:rPr>
-              <w:t>Brier Score</w:t>
-            </w:r>
-            <w:r>
-              <w:t xml:space="preserve"> </w:t>
-            </w:r>
+              <w:t>Holdout accuracy</w:t>
+            </w:r>
+            <w:r/>
           </w:p>
         </w:tc>
       </w:tr>
@@ -3005,11 +2924,9 @@
               <w:rPr>
                 <w:sz w:val="18"/>
               </w:rPr>
-              <w:t>7-day</w:t>
-            </w:r>
-            <w:r>
-              <w:t xml:space="preserve"> </w:t>
-            </w:r>
+              <w:t>USD/RWF</w:t>
+            </w:r>
+            <w:r/>
           </w:p>
         </w:tc>
         <w:tc>
@@ -3031,9 +2948,96 @@
               <w:rPr>
                 <w:sz w:val="18"/>
               </w:rPr>
-              <w:t xml:space="preserve">Logistic </w:t>
-            </w:r>
-          </w:p>
+              <w:t>7-day</w:t>
+            </w:r>
+          </w:p>
+        </w:tc>
+        <w:tc>
+          <w:tcPr>
+            <w:tcW w:w="1340" w:type="dxa"/>
+            <w:tcBorders>
+              <w:top w:val="single" w:sz="8" w:space="0" w:color="DADCE0"/>
+              <w:left w:val="single" w:sz="8" w:space="0" w:color="DADCE0"/>
+              <w:bottom w:val="single" w:sz="8" w:space="0" w:color="DADCE0"/>
+              <w:right w:val="single" w:sz="8" w:space="0" w:color="DADCE0"/>
+            </w:tcBorders>
+            <w:vAlign w:val="center"/>
+          </w:tcPr>
+          <w:p>
+            <w:pPr>
+              <w:spacing w:after="0" w:line="259" w:lineRule="auto"/>
+              <w:ind w:firstLine="0"/>
+            </w:pPr>
+            <w:r>
+              <w:rPr>
+                <w:sz w:val="18"/>
+              </w:rPr>
+              <w:t>Logistic Regression</w:t>
+            </w:r>
+            <w:r/>
+          </w:p>
+        </w:tc>
+        <w:tc>
+          <w:tcPr>
+            <w:tcW w:w="1340" w:type="dxa"/>
+            <w:tcBorders>
+              <w:top w:val="single" w:sz="8" w:space="0" w:color="DADCE0"/>
+              <w:left w:val="single" w:sz="8" w:space="0" w:color="DADCE0"/>
+              <w:bottom w:val="single" w:sz="8" w:space="0" w:color="DADCE0"/>
+              <w:right w:val="single" w:sz="8" w:space="0" w:color="DADCE0"/>
+            </w:tcBorders>
+            <w:vAlign w:val="center"/>
+          </w:tcPr>
+          <w:p>
+            <w:pPr>
+              <w:spacing w:after="0" w:line="259" w:lineRule="auto"/>
+              <w:ind w:left="5" w:firstLine="0"/>
+            </w:pPr>
+            <w:r>
+              <w:rPr>
+                <w:sz w:val="18"/>
+              </w:rPr>
+              <w:t>0.5473</w:t>
+            </w:r>
+            <w:r/>
+          </w:p>
+        </w:tc>
+        <w:tc>
+          <w:tcPr>
+            <w:tcW w:w="1320" w:type="dxa"/>
+            <w:tcBorders>
+              <w:top w:val="single" w:sz="8" w:space="0" w:color="DADCE0"/>
+              <w:left w:val="single" w:sz="8" w:space="0" w:color="DADCE0"/>
+              <w:bottom w:val="single" w:sz="8" w:space="0" w:color="DADCE0"/>
+              <w:right w:val="single" w:sz="8" w:space="0" w:color="DADCE0"/>
+            </w:tcBorders>
+            <w:vAlign w:val="center"/>
+          </w:tcPr>
+          <w:p>
+            <w:pPr>
+              <w:spacing w:after="0" w:line="259" w:lineRule="auto"/>
+              <w:ind w:left="0" w:firstLine="0"/>
+            </w:pPr>
+            <w:r>
+              <w:rPr>
+                <w:sz w:val="18"/>
+              </w:rPr>
+              <w:t>0.5173</w:t>
+            </w:r>
+            <w:r/>
+          </w:p>
+        </w:tc>
+        <w:tc>
+          <w:tcPr>
+            <w:tcW w:w="1340" w:type="dxa"/>
+            <w:tcBorders>
+              <w:top w:val="single" w:sz="8" w:space="0" w:color="DADCE0"/>
+              <w:left w:val="single" w:sz="8" w:space="0" w:color="DADCE0"/>
+              <w:bottom w:val="single" w:sz="8" w:space="0" w:color="DADCE0"/>
+              <w:right w:val="single" w:sz="8" w:space="0" w:color="DADCE0"/>
+            </w:tcBorders>
+            <w:vAlign w:val="center"/>
+          </w:tcPr>
           <w:p>
             <w:pPr>
               <w:spacing w:after="0" w:line="259" w:lineRule="auto"/>
@@ -3043,11 +3047,9 @@
               <w:rPr>
                 <w:sz w:val="18"/>
               </w:rPr>
-              <w:t>Regression</w:t>
-            </w:r>
-            <w:r>
-              <w:t xml:space="preserve"> </w:t>
-            </w:r>
+              <w:t>0.4474</w:t>
+            </w:r>
+            <w:r/>
           </w:p>
         </w:tc>
         <w:tc>
@@ -3070,119 +3072,9 @@
               <w:rPr>
                 <w:sz w:val="18"/>
               </w:rPr>
-              <w:t>1.0000</w:t>
-            </w:r>
-            <w:r>
-              <w:t xml:space="preserve"> </w:t>
-            </w:r>
-          </w:p>
-        </w:tc>
-        <w:tc>
-          <w:tcPr>
-            <w:tcW w:w="1340" w:type="dxa"/>
-            <w:tcBorders>
-              <w:top w:val="single" w:sz="8" w:space="0" w:color="DADCE0"/>
-              <w:left w:val="single" w:sz="8" w:space="0" w:color="DADCE0"/>
-              <w:bottom w:val="single" w:sz="8" w:space="0" w:color="DADCE0"/>
-              <w:right w:val="single" w:sz="8" w:space="0" w:color="DADCE0"/>
-            </w:tcBorders>
-            <w:vAlign w:val="center"/>
-          </w:tcPr>
-          <w:p>
-            <w:pPr>
-              <w:spacing w:after="0" w:line="259" w:lineRule="auto"/>
-              <w:ind w:left="5" w:firstLine="0"/>
-            </w:pPr>
-            <w:r>
-              <w:rPr>
-                <w:sz w:val="18"/>
-              </w:rPr>
-              <w:t>1.0000</w:t>
-            </w:r>
-            <w:r>
-              <w:t xml:space="preserve"> </w:t>
-            </w:r>
-          </w:p>
-        </w:tc>
-        <w:tc>
-          <w:tcPr>
-            <w:tcW w:w="1320" w:type="dxa"/>
-            <w:tcBorders>
-              <w:top w:val="single" w:sz="8" w:space="0" w:color="DADCE0"/>
-              <w:left w:val="single" w:sz="8" w:space="0" w:color="DADCE0"/>
-              <w:bottom w:val="single" w:sz="8" w:space="0" w:color="DADCE0"/>
-              <w:right w:val="single" w:sz="8" w:space="0" w:color="DADCE0"/>
-            </w:tcBorders>
-            <w:vAlign w:val="center"/>
-          </w:tcPr>
-          <w:p>
-            <w:pPr>
-              <w:spacing w:after="0" w:line="259" w:lineRule="auto"/>
-              <w:ind w:left="0" w:firstLine="0"/>
-            </w:pPr>
-            <w:r>
-              <w:rPr>
-                <w:sz w:val="18"/>
-              </w:rPr>
-              <w:t>1.0000</w:t>
-            </w:r>
-            <w:r>
-              <w:t xml:space="preserve"> </w:t>
-            </w:r>
-          </w:p>
-        </w:tc>
-        <w:tc>
-          <w:tcPr>
-            <w:tcW w:w="1340" w:type="dxa"/>
-            <w:tcBorders>
-              <w:top w:val="single" w:sz="8" w:space="0" w:color="DADCE0"/>
-              <w:left w:val="single" w:sz="8" w:space="0" w:color="DADCE0"/>
-              <w:bottom w:val="single" w:sz="8" w:space="0" w:color="DADCE0"/>
-              <w:right w:val="single" w:sz="8" w:space="0" w:color="DADCE0"/>
-            </w:tcBorders>
-            <w:vAlign w:val="center"/>
-          </w:tcPr>
-          <w:p>
-            <w:pPr>
-              <w:spacing w:after="0" w:line="259" w:lineRule="auto"/>
-              <w:ind w:left="15" w:firstLine="0"/>
-            </w:pPr>
-            <w:r>
-              <w:rPr>
-                <w:sz w:val="18"/>
-              </w:rPr>
-              <w:t>2.5922</w:t>
-            </w:r>
-            <w:r>
-              <w:t xml:space="preserve"> </w:t>
-            </w:r>
-          </w:p>
-        </w:tc>
-        <w:tc>
-          <w:tcPr>
-            <w:tcW w:w="1340" w:type="dxa"/>
-            <w:tcBorders>
-              <w:top w:val="single" w:sz="8" w:space="0" w:color="DADCE0"/>
-              <w:left w:val="single" w:sz="8" w:space="0" w:color="DADCE0"/>
-              <w:bottom w:val="single" w:sz="8" w:space="0" w:color="DADCE0"/>
-              <w:right w:val="single" w:sz="8" w:space="0" w:color="DADCE0"/>
-            </w:tcBorders>
-            <w:vAlign w:val="center"/>
-          </w:tcPr>
-          <w:p>
-            <w:pPr>
-              <w:spacing w:after="0" w:line="259" w:lineRule="auto"/>
-              <w:ind w:firstLine="0"/>
-            </w:pPr>
-            <w:r>
-              <w:rPr>
-                <w:sz w:val="18"/>
-              </w:rPr>
-              <w:t>0.0121</w:t>
-            </w:r>
-            <w:r>
-              <w:t xml:space="preserve"> </w:t>
-            </w:r>
+              <w:t>1.0000*</w:t>
+            </w:r>
+            <w:r/>
           </w:p>
         </w:tc>
       </w:tr>
@@ -3210,11 +3102,9 @@
               <w:rPr>
                 <w:sz w:val="18"/>
               </w:rPr>
-              <w:t>7-day</w:t>
-            </w:r>
-            <w:r>
-              <w:t xml:space="preserve"> </w:t>
-            </w:r>
+              <w:t>USD/RWF</w:t>
+            </w:r>
+            <w:r/>
           </w:p>
         </w:tc>
         <w:tc>
@@ -3236,11 +3126,9 @@
               <w:rPr>
                 <w:sz w:val="18"/>
               </w:rPr>
-              <w:t>Random Forest</w:t>
-            </w:r>
-            <w:r>
-              <w:t xml:space="preserve"> </w:t>
-            </w:r>
+              <w:t>14-day</w:t>
+            </w:r>
+            <w:r/>
           </w:p>
         </w:tc>
         <w:tc>
@@ -3263,11 +3151,9 @@
               <w:rPr>
                 <w:sz w:val="18"/>
               </w:rPr>
-              <w:t>1.0000</w:t>
-            </w:r>
-            <w:r>
-              <w:t xml:space="preserve"> </w:t>
-            </w:r>
+              <w:t>Logistic Regression</w:t>
+            </w:r>
+            <w:r/>
           </w:p>
         </w:tc>
         <w:tc>
@@ -3290,11 +3176,9 @@
               <w:rPr>
                 <w:sz w:val="18"/>
               </w:rPr>
-              <w:t>1.0000</w:t>
-            </w:r>
-            <w:r>
-              <w:t xml:space="preserve"> </w:t>
-            </w:r>
+              <w:t>0.5963</w:t>
+            </w:r>
+            <w:r/>
           </w:p>
         </w:tc>
         <w:tc>
@@ -3317,11 +3201,9 @@
               <w:rPr>
                 <w:sz w:val="18"/>
               </w:rPr>
-              <w:t>1.0000</w:t>
-            </w:r>
-            <w:r>
-              <w:t xml:space="preserve"> </w:t>
-            </w:r>
+              <w:t>0.4420</w:t>
+            </w:r>
+            <w:r/>
           </w:p>
         </w:tc>
         <w:tc>
@@ -3344,11 +3226,9 @@
               <w:rPr>
                 <w:sz w:val="18"/>
               </w:rPr>
-              <w:t>3.8746</w:t>
-            </w:r>
-            <w:r>
-              <w:t xml:space="preserve"> </w:t>
-            </w:r>
+              <w:t>0.4044</w:t>
+            </w:r>
+            <w:r/>
           </w:p>
         </w:tc>
         <w:tc>
@@ -3371,11 +3251,9 @@
               <w:rPr>
                 <w:sz w:val="18"/>
               </w:rPr>
-              <w:t>0.0035</w:t>
-            </w:r>
-            <w:r>
-              <w:t xml:space="preserve"> </w:t>
-            </w:r>
+              <w:t>1.0000*</w:t>
+            </w:r>
+            <w:r/>
           </w:p>
         </w:tc>
       </w:tr>
@@ -3402,11 +3280,33 @@
               <w:rPr>
                 <w:sz w:val="18"/>
               </w:rPr>
+              <w:t>EUR/RWF</w:t>
+            </w:r>
+            <w:r/>
+          </w:p>
+        </w:tc>
+        <w:tc>
+          <w:tcPr>
+            <w:tcW w:w="1340" w:type="dxa"/>
+            <w:tcBorders>
+              <w:top w:val="single" w:sz="8" w:space="0" w:color="DADCE0"/>
+              <w:left w:val="single" w:sz="8" w:space="0" w:color="DADCE0"/>
+              <w:bottom w:val="single" w:sz="8" w:space="0" w:color="DADCE0"/>
+              <w:right w:val="single" w:sz="8" w:space="0" w:color="DADCE0"/>
+            </w:tcBorders>
+          </w:tcPr>
+          <w:p>
+            <w:pPr>
+              <w:spacing w:after="0" w:line="259" w:lineRule="auto"/>
+              <w:ind w:left="15" w:firstLine="0"/>
+            </w:pPr>
+            <w:r>
+              <w:rPr>
+                <w:sz w:val="18"/>
+              </w:rPr>
               <w:t>7-day</w:t>
             </w:r>
-            <w:r>
-              <w:t xml:space="preserve"> </w:t>
-            </w:r>
+            <w:r/>
           </w:p>
         </w:tc>
         <w:tc>
@@ -3422,17 +3322,87 @@
           <w:p>
             <w:pPr>
               <w:spacing w:after="0" w:line="259" w:lineRule="auto"/>
+              <w:ind w:firstLine="0"/>
+            </w:pPr>
+            <w:r>
+              <w:rPr>
+                <w:sz w:val="18"/>
+              </w:rPr>
+              <w:t>Random Forest</w:t>
+            </w:r>
+            <w:r/>
+          </w:p>
+        </w:tc>
+        <w:tc>
+          <w:tcPr>
+            <w:tcW w:w="1340" w:type="dxa"/>
+            <w:tcBorders>
+              <w:top w:val="single" w:sz="8" w:space="0" w:color="DADCE0"/>
+              <w:left w:val="single" w:sz="8" w:space="0" w:color="DADCE0"/>
+              <w:bottom w:val="single" w:sz="8" w:space="0" w:color="DADCE0"/>
+              <w:right w:val="single" w:sz="8" w:space="0" w:color="DADCE0"/>
+            </w:tcBorders>
+          </w:tcPr>
+          <w:p>
+            <w:pPr>
+              <w:spacing w:after="0" w:line="259" w:lineRule="auto"/>
+              <w:ind w:left="5" w:firstLine="0"/>
+            </w:pPr>
+            <w:r>
+              <w:rPr>
+                <w:sz w:val="18"/>
+              </w:rPr>
+              <w:t>0.4136</w:t>
+            </w:r>
+            <w:r/>
+          </w:p>
+        </w:tc>
+        <w:tc>
+          <w:tcPr>
+            <w:tcW w:w="1320" w:type="dxa"/>
+            <w:tcBorders>
+              <w:top w:val="single" w:sz="8" w:space="0" w:color="DADCE0"/>
+              <w:left w:val="single" w:sz="8" w:space="0" w:color="DADCE0"/>
+              <w:bottom w:val="single" w:sz="8" w:space="0" w:color="DADCE0"/>
+              <w:right w:val="single" w:sz="8" w:space="0" w:color="DADCE0"/>
+            </w:tcBorders>
+          </w:tcPr>
+          <w:p>
+            <w:pPr>
+              <w:spacing w:after="0" w:line="259" w:lineRule="auto"/>
+              <w:ind w:left="0" w:firstLine="0"/>
+            </w:pPr>
+            <w:r>
+              <w:rPr>
+                <w:sz w:val="18"/>
+              </w:rPr>
+              <w:t>0.3462</w:t>
+            </w:r>
+            <w:r/>
+          </w:p>
+        </w:tc>
+        <w:tc>
+          <w:tcPr>
+            <w:tcW w:w="1340" w:type="dxa"/>
+            <w:tcBorders>
+              <w:top w:val="single" w:sz="8" w:space="0" w:color="DADCE0"/>
+              <w:left w:val="single" w:sz="8" w:space="0" w:color="DADCE0"/>
+              <w:bottom w:val="single" w:sz="8" w:space="0" w:color="DADCE0"/>
+              <w:right w:val="single" w:sz="8" w:space="0" w:color="DADCE0"/>
+            </w:tcBorders>
+          </w:tcPr>
+          <w:p>
+            <w:pPr>
+              <w:spacing w:after="0" w:line="259" w:lineRule="auto"/>
               <w:ind w:left="15" w:firstLine="0"/>
             </w:pPr>
             <w:r>
               <w:rPr>
                 <w:sz w:val="18"/>
               </w:rPr>
-              <w:t>XGBoost</w:t>
-            </w:r>
-            <w:r>
-              <w:t xml:space="preserve"> </w:t>
-            </w:r>
+              <w:t>0.2667</w:t>
+            </w:r>
+            <w:r/>
           </w:p>
         </w:tc>
         <w:tc>
@@ -3454,115 +3424,9 @@
               <w:rPr>
                 <w:sz w:val="18"/>
               </w:rPr>
-              <w:t>1.0000</w:t>
-            </w:r>
-            <w:r>
-              <w:t xml:space="preserve"> </w:t>
-            </w:r>
-          </w:p>
-        </w:tc>
-        <w:tc>
-          <w:tcPr>
-            <w:tcW w:w="1340" w:type="dxa"/>
-            <w:tcBorders>
-              <w:top w:val="single" w:sz="8" w:space="0" w:color="DADCE0"/>
-              <w:left w:val="single" w:sz="8" w:space="0" w:color="DADCE0"/>
-              <w:bottom w:val="single" w:sz="8" w:space="0" w:color="DADCE0"/>
-              <w:right w:val="single" w:sz="8" w:space="0" w:color="DADCE0"/>
-            </w:tcBorders>
-          </w:tcPr>
-          <w:p>
-            <w:pPr>
-              <w:spacing w:after="0" w:line="259" w:lineRule="auto"/>
-              <w:ind w:left="5" w:firstLine="0"/>
-            </w:pPr>
-            <w:r>
-              <w:rPr>
-                <w:sz w:val="18"/>
-              </w:rPr>
-              <w:t>1.0000</w:t>
-            </w:r>
-            <w:r>
-              <w:t xml:space="preserve"> </w:t>
-            </w:r>
-          </w:p>
-        </w:tc>
-        <w:tc>
-          <w:tcPr>
-            <w:tcW w:w="1320" w:type="dxa"/>
-            <w:tcBorders>
-              <w:top w:val="single" w:sz="8" w:space="0" w:color="DADCE0"/>
-              <w:left w:val="single" w:sz="8" w:space="0" w:color="DADCE0"/>
-              <w:bottom w:val="single" w:sz="8" w:space="0" w:color="DADCE0"/>
-              <w:right w:val="single" w:sz="8" w:space="0" w:color="DADCE0"/>
-            </w:tcBorders>
-          </w:tcPr>
-          <w:p>
-            <w:pPr>
-              <w:spacing w:after="0" w:line="259" w:lineRule="auto"/>
-              <w:ind w:left="0" w:firstLine="0"/>
-            </w:pPr>
-            <w:r>
-              <w:rPr>
-                <w:sz w:val="18"/>
-              </w:rPr>
-              <w:t>1.0000</w:t>
-            </w:r>
-            <w:r>
-              <w:t xml:space="preserve"> </w:t>
-            </w:r>
-          </w:p>
-        </w:tc>
-        <w:tc>
-          <w:tcPr>
-            <w:tcW w:w="1340" w:type="dxa"/>
-            <w:tcBorders>
-              <w:top w:val="single" w:sz="8" w:space="0" w:color="DADCE0"/>
-              <w:left w:val="single" w:sz="8" w:space="0" w:color="DADCE0"/>
-              <w:bottom w:val="single" w:sz="8" w:space="0" w:color="DADCE0"/>
-              <w:right w:val="single" w:sz="8" w:space="0" w:color="DADCE0"/>
-            </w:tcBorders>
-          </w:tcPr>
-          <w:p>
-            <w:pPr>
-              <w:spacing w:after="0" w:line="259" w:lineRule="auto"/>
-              <w:ind w:left="15" w:firstLine="0"/>
-            </w:pPr>
-            <w:r>
-              <w:rPr>
-                <w:sz w:val="18"/>
-              </w:rPr>
-              <w:t>4.7543</w:t>
-            </w:r>
-            <w:r>
-              <w:t xml:space="preserve"> </w:t>
-            </w:r>
-          </w:p>
-        </w:tc>
-        <w:tc>
-          <w:tcPr>
-            <w:tcW w:w="1340" w:type="dxa"/>
-            <w:tcBorders>
-              <w:top w:val="single" w:sz="8" w:space="0" w:color="DADCE0"/>
-              <w:left w:val="single" w:sz="8" w:space="0" w:color="DADCE0"/>
-              <w:bottom w:val="single" w:sz="8" w:space="0" w:color="DADCE0"/>
-              <w:right w:val="single" w:sz="8" w:space="0" w:color="DADCE0"/>
-            </w:tcBorders>
-          </w:tcPr>
-          <w:p>
-            <w:pPr>
-              <w:spacing w:after="0" w:line="259" w:lineRule="auto"/>
-              <w:ind w:firstLine="0"/>
-            </w:pPr>
-            <w:r>
-              <w:rPr>
-                <w:sz w:val="18"/>
-              </w:rPr>
-              <w:t>0.0002</w:t>
-            </w:r>
-            <w:r>
-              <w:t xml:space="preserve"> </w:t>
-            </w:r>
+              <w:t>0.4691</w:t>
+            </w:r>
+            <w:r/>
           </w:p>
         </w:tc>
       </w:tr>
@@ -3590,11 +3454,9 @@
               <w:rPr>
                 <w:sz w:val="18"/>
               </w:rPr>
-              <w:t>14-day</w:t>
-            </w:r>
-            <w:r>
-              <w:t xml:space="preserve"> </w:t>
-            </w:r>
+              <w:t>EUR/RWF</w:t>
+            </w:r>
+            <w:r/>
           </w:p>
         </w:tc>
         <w:tc>
@@ -3616,9 +3478,96 @@
               <w:rPr>
                 <w:sz w:val="18"/>
               </w:rPr>
-              <w:t xml:space="preserve">Logistic </w:t>
-            </w:r>
-          </w:p>
+              <w:t>14-day</w:t>
+            </w:r>
+          </w:p>
+        </w:tc>
+        <w:tc>
+          <w:tcPr>
+            <w:tcW w:w="1340" w:type="dxa"/>
+            <w:tcBorders>
+              <w:top w:val="single" w:sz="8" w:space="0" w:color="DADCE0"/>
+              <w:left w:val="single" w:sz="8" w:space="0" w:color="DADCE0"/>
+              <w:bottom w:val="single" w:sz="8" w:space="0" w:color="DADCE0"/>
+              <w:right w:val="single" w:sz="8" w:space="0" w:color="DADCE0"/>
+            </w:tcBorders>
+            <w:vAlign w:val="center"/>
+          </w:tcPr>
+          <w:p>
+            <w:pPr>
+              <w:spacing w:after="0" w:line="259" w:lineRule="auto"/>
+              <w:ind w:firstLine="0"/>
+            </w:pPr>
+            <w:r>
+              <w:rPr>
+                <w:sz w:val="18"/>
+              </w:rPr>
+              <w:t>Logistic Regression</w:t>
+            </w:r>
+            <w:r/>
+          </w:p>
+        </w:tc>
+        <w:tc>
+          <w:tcPr>
+            <w:tcW w:w="1340" w:type="dxa"/>
+            <w:tcBorders>
+              <w:top w:val="single" w:sz="8" w:space="0" w:color="DADCE0"/>
+              <w:left w:val="single" w:sz="8" w:space="0" w:color="DADCE0"/>
+              <w:bottom w:val="single" w:sz="8" w:space="0" w:color="DADCE0"/>
+              <w:right w:val="single" w:sz="8" w:space="0" w:color="DADCE0"/>
+            </w:tcBorders>
+            <w:vAlign w:val="center"/>
+          </w:tcPr>
+          <w:p>
+            <w:pPr>
+              <w:spacing w:after="0" w:line="259" w:lineRule="auto"/>
+              <w:ind w:left="5" w:firstLine="0"/>
+            </w:pPr>
+            <w:r>
+              <w:rPr>
+                <w:sz w:val="18"/>
+              </w:rPr>
+              <w:t>0.3333</w:t>
+            </w:r>
+            <w:r/>
+          </w:p>
+        </w:tc>
+        <w:tc>
+          <w:tcPr>
+            <w:tcW w:w="1320" w:type="dxa"/>
+            <w:tcBorders>
+              <w:top w:val="single" w:sz="8" w:space="0" w:color="DADCE0"/>
+              <w:left w:val="single" w:sz="8" w:space="0" w:color="DADCE0"/>
+              <w:bottom w:val="single" w:sz="8" w:space="0" w:color="DADCE0"/>
+              <w:right w:val="single" w:sz="8" w:space="0" w:color="DADCE0"/>
+            </w:tcBorders>
+            <w:vAlign w:val="center"/>
+          </w:tcPr>
+          <w:p>
+            <w:pPr>
+              <w:spacing w:after="0" w:line="259" w:lineRule="auto"/>
+              <w:ind w:left="0" w:firstLine="0"/>
+            </w:pPr>
+            <w:r>
+              <w:rPr>
+                <w:sz w:val="18"/>
+              </w:rPr>
+              <w:t>0.3323</w:t>
+            </w:r>
+            <w:r/>
+          </w:p>
+        </w:tc>
+        <w:tc>
+          <w:tcPr>
+            <w:tcW w:w="1340" w:type="dxa"/>
+            <w:tcBorders>
+              <w:top w:val="single" w:sz="8" w:space="0" w:color="DADCE0"/>
+              <w:left w:val="single" w:sz="8" w:space="0" w:color="DADCE0"/>
+              <w:bottom w:val="single" w:sz="8" w:space="0" w:color="DADCE0"/>
+              <w:right w:val="single" w:sz="8" w:space="0" w:color="DADCE0"/>
+            </w:tcBorders>
+            <w:vAlign w:val="center"/>
+          </w:tcPr>
           <w:p>
             <w:pPr>
               <w:spacing w:after="0" w:line="259" w:lineRule="auto"/>
@@ -3628,11 +3577,9 @@
               <w:rPr>
                 <w:sz w:val="18"/>
               </w:rPr>
-              <w:t>Regression</w:t>
-            </w:r>
-            <w:r>
-              <w:t xml:space="preserve"> </w:t>
-            </w:r>
+              <w:t>0.2376</w:t>
+            </w:r>
+            <w:r/>
           </w:p>
         </w:tc>
         <w:tc>
@@ -3655,119 +3602,9 @@
               <w:rPr>
                 <w:sz w:val="18"/>
               </w:rPr>
-              <w:t>1.0000</w:t>
-            </w:r>
-            <w:r>
-              <w:t xml:space="preserve"> </w:t>
-            </w:r>
-          </w:p>
-        </w:tc>
-        <w:tc>
-          <w:tcPr>
-            <w:tcW w:w="1340" w:type="dxa"/>
-            <w:tcBorders>
-              <w:top w:val="single" w:sz="8" w:space="0" w:color="DADCE0"/>
-              <w:left w:val="single" w:sz="8" w:space="0" w:color="DADCE0"/>
-              <w:bottom w:val="single" w:sz="8" w:space="0" w:color="DADCE0"/>
-              <w:right w:val="single" w:sz="8" w:space="0" w:color="DADCE0"/>
-            </w:tcBorders>
-            <w:vAlign w:val="center"/>
-          </w:tcPr>
-          <w:p>
-            <w:pPr>
-              <w:spacing w:after="0" w:line="259" w:lineRule="auto"/>
-              <w:ind w:left="5" w:firstLine="0"/>
-            </w:pPr>
-            <w:r>
-              <w:rPr>
-                <w:sz w:val="18"/>
-              </w:rPr>
-              <w:t>1.0000</w:t>
-            </w:r>
-            <w:r>
-              <w:t xml:space="preserve"> </w:t>
-            </w:r>
-          </w:p>
-        </w:tc>
-        <w:tc>
-          <w:tcPr>
-            <w:tcW w:w="1320" w:type="dxa"/>
-            <w:tcBorders>
-              <w:top w:val="single" w:sz="8" w:space="0" w:color="DADCE0"/>
-              <w:left w:val="single" w:sz="8" w:space="0" w:color="DADCE0"/>
-              <w:bottom w:val="single" w:sz="8" w:space="0" w:color="DADCE0"/>
-              <w:right w:val="single" w:sz="8" w:space="0" w:color="DADCE0"/>
-            </w:tcBorders>
-            <w:vAlign w:val="center"/>
-          </w:tcPr>
-          <w:p>
-            <w:pPr>
-              <w:spacing w:after="0" w:line="259" w:lineRule="auto"/>
-              <w:ind w:left="0" w:firstLine="0"/>
-            </w:pPr>
-            <w:r>
-              <w:rPr>
-                <w:sz w:val="18"/>
-              </w:rPr>
-              <w:t>1.0000</w:t>
-            </w:r>
-            <w:r>
-              <w:t xml:space="preserve"> </w:t>
-            </w:r>
-          </w:p>
-        </w:tc>
-        <w:tc>
-          <w:tcPr>
-            <w:tcW w:w="1340" w:type="dxa"/>
-            <w:tcBorders>
-              <w:top w:val="single" w:sz="8" w:space="0" w:color="DADCE0"/>
-              <w:left w:val="single" w:sz="8" w:space="0" w:color="DADCE0"/>
-              <w:bottom w:val="single" w:sz="8" w:space="0" w:color="DADCE0"/>
-              <w:right w:val="single" w:sz="8" w:space="0" w:color="DADCE0"/>
-            </w:tcBorders>
-            <w:vAlign w:val="center"/>
-          </w:tcPr>
-          <w:p>
-            <w:pPr>
-              <w:spacing w:after="0" w:line="259" w:lineRule="auto"/>
-              <w:ind w:left="15" w:firstLine="0"/>
-            </w:pPr>
-            <w:r>
-              <w:rPr>
-                <w:sz w:val="18"/>
-              </w:rPr>
-              <w:t>4.3428</w:t>
-            </w:r>
-            <w:r>
-              <w:t xml:space="preserve"> </w:t>
-            </w:r>
-          </w:p>
-        </w:tc>
-        <w:tc>
-          <w:tcPr>
-            <w:tcW w:w="1340" w:type="dxa"/>
-            <w:tcBorders>
-              <w:top w:val="single" w:sz="8" w:space="0" w:color="DADCE0"/>
-              <w:left w:val="single" w:sz="8" w:space="0" w:color="DADCE0"/>
-              <w:bottom w:val="single" w:sz="8" w:space="0" w:color="DADCE0"/>
-              <w:right w:val="single" w:sz="8" w:space="0" w:color="DADCE0"/>
-            </w:tcBorders>
-            <w:vAlign w:val="center"/>
-          </w:tcPr>
-          <w:p>
-            <w:pPr>
-              <w:spacing w:after="0" w:line="259" w:lineRule="auto"/>
-              <w:ind w:firstLine="0"/>
-            </w:pPr>
-            <w:r>
-              <w:rPr>
-                <w:sz w:val="18"/>
-              </w:rPr>
-              <w:t>0.0004</w:t>
-            </w:r>
-            <w:r>
-              <w:t xml:space="preserve"> </w:t>
-            </w:r>
+              <w:t>0.6285</w:t>
+            </w:r>
+            <w:r/>
           </w:p>
         </w:tc>
       </w:tr>
@@ -3795,11 +3632,9 @@
               <w:rPr>
                 <w:sz w:val="18"/>
               </w:rPr>
-              <w:t>14-day</w:t>
-            </w:r>
-            <w:r>
-              <w:t xml:space="preserve"> </w:t>
-            </w:r>
+              <w:t>KES/RWF</w:t>
+            </w:r>
+            <w:r/>
           </w:p>
         </w:tc>
         <w:tc>
@@ -3821,11 +3656,9 @@
               <w:rPr>
                 <w:sz w:val="18"/>
               </w:rPr>
-              <w:t>Random Forest</w:t>
-            </w:r>
-            <w:r>
-              <w:t xml:space="preserve"> </w:t>
-            </w:r>
+              <w:t>7-day</w:t>
+            </w:r>
+            <w:r/>
           </w:p>
         </w:tc>
         <w:tc>
@@ -3848,11 +3681,9 @@
               <w:rPr>
                 <w:sz w:val="18"/>
               </w:rPr>
-              <w:t>1.0000</w:t>
-            </w:r>
-            <w:r>
-              <w:t xml:space="preserve"> </w:t>
-            </w:r>
+              <w:t>Logistic Regression</w:t>
+            </w:r>
+            <w:r/>
           </w:p>
         </w:tc>
         <w:tc>
@@ -3875,11 +3706,9 @@
               <w:rPr>
                 <w:sz w:val="18"/>
               </w:rPr>
-              <w:t>1.0000</w:t>
-            </w:r>
-            <w:r>
-              <w:t xml:space="preserve"> </w:t>
-            </w:r>
+              <w:t>0.4177</w:t>
+            </w:r>
+            <w:r/>
           </w:p>
         </w:tc>
         <w:tc>
@@ -3902,11 +3731,9 @@
               <w:rPr>
                 <w:sz w:val="18"/>
               </w:rPr>
-              <w:t>1.0000</w:t>
-            </w:r>
-            <w:r>
-              <w:t xml:space="preserve"> </w:t>
-            </w:r>
+              <w:t>0.3555</w:t>
+            </w:r>
+            <w:r/>
           </w:p>
         </w:tc>
         <w:tc>
@@ -3929,11 +3756,9 @@
               <w:rPr>
                 <w:sz w:val="18"/>
               </w:rPr>
-              <w:t>3.6105</w:t>
-            </w:r>
-            <w:r>
-              <w:t xml:space="preserve"> </w:t>
-            </w:r>
+              <w:t>0.2283</w:t>
+            </w:r>
+            <w:r/>
           </w:p>
         </w:tc>
         <w:tc>
@@ -3956,11 +3781,9 @@
               <w:rPr>
                 <w:sz w:val="18"/>
               </w:rPr>
-              <w:t>0.0021</w:t>
-            </w:r>
-            <w:r>
-              <w:t xml:space="preserve"> </w:t>
-            </w:r>
+              <w:t>0.4815</w:t>
+            </w:r>
+            <w:r/>
           </w:p>
         </w:tc>
       </w:tr>
@@ -3987,11 +3810,33 @@
               <w:rPr>
                 <w:sz w:val="18"/>
               </w:rPr>
+              <w:t>KES/RWF</w:t>
+            </w:r>
+            <w:r/>
+          </w:p>
+        </w:tc>
+        <w:tc>
+          <w:tcPr>
+            <w:tcW w:w="1340" w:type="dxa"/>
+            <w:tcBorders>
+              <w:top w:val="single" w:sz="8" w:space="0" w:color="DADCE0"/>
+              <w:left w:val="single" w:sz="8" w:space="0" w:color="DADCE0"/>
+              <w:bottom w:val="single" w:sz="8" w:space="0" w:color="DADCE0"/>
+              <w:right w:val="single" w:sz="8" w:space="0" w:color="DADCE0"/>
+            </w:tcBorders>
+          </w:tcPr>
+          <w:p>
+            <w:pPr>
+              <w:spacing w:after="0" w:line="259" w:lineRule="auto"/>
+              <w:ind w:left="15" w:firstLine="0"/>
+            </w:pPr>
+            <w:r>
+              <w:rPr>
+                <w:sz w:val="18"/>
+              </w:rPr>
               <w:t>14-day</w:t>
             </w:r>
-            <w:r>
-              <w:t xml:space="preserve"> </w:t>
-            </w:r>
+            <w:r/>
           </w:p>
         </w:tc>
         <w:tc>
@@ -4007,17 +3852,87 @@
           <w:p>
             <w:pPr>
               <w:spacing w:after="0" w:line="259" w:lineRule="auto"/>
+              <w:ind w:firstLine="0"/>
+            </w:pPr>
+            <w:r>
+              <w:rPr>
+                <w:sz w:val="18"/>
+              </w:rPr>
+              <w:t>Logistic Regression</w:t>
+            </w:r>
+            <w:r/>
+          </w:p>
+        </w:tc>
+        <w:tc>
+          <w:tcPr>
+            <w:tcW w:w="1340" w:type="dxa"/>
+            <w:tcBorders>
+              <w:top w:val="single" w:sz="8" w:space="0" w:color="DADCE0"/>
+              <w:left w:val="single" w:sz="8" w:space="0" w:color="DADCE0"/>
+              <w:bottom w:val="single" w:sz="8" w:space="0" w:color="DADCE0"/>
+              <w:right w:val="single" w:sz="8" w:space="0" w:color="DADCE0"/>
+            </w:tcBorders>
+          </w:tcPr>
+          <w:p>
+            <w:pPr>
+              <w:spacing w:after="0" w:line="259" w:lineRule="auto"/>
+              <w:ind w:left="5" w:firstLine="0"/>
+            </w:pPr>
+            <w:r>
+              <w:rPr>
+                <w:sz w:val="18"/>
+              </w:rPr>
+              <w:t>0.4493</w:t>
+            </w:r>
+            <w:r/>
+          </w:p>
+        </w:tc>
+        <w:tc>
+          <w:tcPr>
+            <w:tcW w:w="1320" w:type="dxa"/>
+            <w:tcBorders>
+              <w:top w:val="single" w:sz="8" w:space="0" w:color="DADCE0"/>
+              <w:left w:val="single" w:sz="8" w:space="0" w:color="DADCE0"/>
+              <w:bottom w:val="single" w:sz="8" w:space="0" w:color="DADCE0"/>
+              <w:right w:val="single" w:sz="8" w:space="0" w:color="DADCE0"/>
+            </w:tcBorders>
+          </w:tcPr>
+          <w:p>
+            <w:pPr>
+              <w:spacing w:after="0" w:line="259" w:lineRule="auto"/>
+              <w:ind w:left="0" w:firstLine="0"/>
+            </w:pPr>
+            <w:r>
+              <w:rPr>
+                <w:sz w:val="18"/>
+              </w:rPr>
+              <w:t>0.3815</w:t>
+            </w:r>
+            <w:r/>
+          </w:p>
+        </w:tc>
+        <w:tc>
+          <w:tcPr>
+            <w:tcW w:w="1340" w:type="dxa"/>
+            <w:tcBorders>
+              <w:top w:val="single" w:sz="8" w:space="0" w:color="DADCE0"/>
+              <w:left w:val="single" w:sz="8" w:space="0" w:color="DADCE0"/>
+              <w:bottom w:val="single" w:sz="8" w:space="0" w:color="DADCE0"/>
+              <w:right w:val="single" w:sz="8" w:space="0" w:color="DADCE0"/>
+            </w:tcBorders>
+          </w:tcPr>
+          <w:p>
+            <w:pPr>
+              <w:spacing w:after="0" w:line="259" w:lineRule="auto"/>
               <w:ind w:left="15" w:firstLine="0"/>
             </w:pPr>
             <w:r>
               <w:rPr>
                 <w:sz w:val="18"/>
               </w:rPr>
-              <w:t>XGBoost</w:t>
-            </w:r>
-            <w:r>
-              <w:t xml:space="preserve"> </w:t>
-            </w:r>
+              <w:t>0.2468</w:t>
+            </w:r>
+            <w:r/>
           </w:p>
         </w:tc>
         <w:tc>
@@ -4039,132 +3954,17 @@
               <w:rPr>
                 <w:sz w:val="18"/>
               </w:rPr>
-              <w:t>1.0000</w:t>
-            </w:r>
-            <w:r>
-              <w:t xml:space="preserve"> </w:t>
-            </w:r>
-          </w:p>
-        </w:tc>
-        <w:tc>
-          <w:tcPr>
-            <w:tcW w:w="1340" w:type="dxa"/>
-            <w:tcBorders>
-              <w:top w:val="single" w:sz="8" w:space="0" w:color="DADCE0"/>
-              <w:left w:val="single" w:sz="8" w:space="0" w:color="DADCE0"/>
-              <w:bottom w:val="single" w:sz="8" w:space="0" w:color="DADCE0"/>
-              <w:right w:val="single" w:sz="8" w:space="0" w:color="DADCE0"/>
-            </w:tcBorders>
-          </w:tcPr>
-          <w:p>
-            <w:pPr>
-              <w:spacing w:after="0" w:line="259" w:lineRule="auto"/>
-              <w:ind w:left="5" w:firstLine="0"/>
-            </w:pPr>
-            <w:r>
-              <w:rPr>
-                <w:sz w:val="18"/>
-              </w:rPr>
-              <w:t>1.0000</w:t>
-            </w:r>
-            <w:r>
-              <w:t xml:space="preserve"> </w:t>
-            </w:r>
-          </w:p>
-        </w:tc>
-        <w:tc>
-          <w:tcPr>
-            <w:tcW w:w="1320" w:type="dxa"/>
-            <w:tcBorders>
-              <w:top w:val="single" w:sz="8" w:space="0" w:color="DADCE0"/>
-              <w:left w:val="single" w:sz="8" w:space="0" w:color="DADCE0"/>
-              <w:bottom w:val="single" w:sz="8" w:space="0" w:color="DADCE0"/>
-              <w:right w:val="single" w:sz="8" w:space="0" w:color="DADCE0"/>
-            </w:tcBorders>
-          </w:tcPr>
-          <w:p>
-            <w:pPr>
-              <w:spacing w:after="0" w:line="259" w:lineRule="auto"/>
-              <w:ind w:left="0" w:firstLine="0"/>
-            </w:pPr>
-            <w:r>
-              <w:rPr>
-                <w:sz w:val="18"/>
-              </w:rPr>
-              <w:t>1.0000</w:t>
-            </w:r>
-            <w:r>
-              <w:t xml:space="preserve"> </w:t>
-            </w:r>
-          </w:p>
-        </w:tc>
-        <w:tc>
-          <w:tcPr>
-            <w:tcW w:w="1340" w:type="dxa"/>
-            <w:tcBorders>
-              <w:top w:val="single" w:sz="8" w:space="0" w:color="DADCE0"/>
-              <w:left w:val="single" w:sz="8" w:space="0" w:color="DADCE0"/>
-              <w:bottom w:val="single" w:sz="8" w:space="0" w:color="DADCE0"/>
-              <w:right w:val="single" w:sz="8" w:space="0" w:color="DADCE0"/>
-            </w:tcBorders>
-          </w:tcPr>
-          <w:p>
-            <w:pPr>
-              <w:spacing w:after="0" w:line="259" w:lineRule="auto"/>
-              <w:ind w:left="15" w:firstLine="0"/>
-            </w:pPr>
-            <w:r>
-              <w:rPr>
-                <w:sz w:val="18"/>
-              </w:rPr>
-              <w:t>5.8187</w:t>
-            </w:r>
-            <w:r>
-              <w:t xml:space="preserve"> </w:t>
-            </w:r>
-          </w:p>
-        </w:tc>
-        <w:tc>
-          <w:tcPr>
-            <w:tcW w:w="1340" w:type="dxa"/>
-            <w:tcBorders>
-              <w:top w:val="single" w:sz="8" w:space="0" w:color="DADCE0"/>
-              <w:left w:val="single" w:sz="8" w:space="0" w:color="DADCE0"/>
-              <w:bottom w:val="single" w:sz="8" w:space="0" w:color="DADCE0"/>
-              <w:right w:val="single" w:sz="8" w:space="0" w:color="DADCE0"/>
-            </w:tcBorders>
-          </w:tcPr>
-          <w:p>
-            <w:pPr>
-              <w:spacing w:after="0" w:line="259" w:lineRule="auto"/>
-              <w:ind w:firstLine="0"/>
-            </w:pPr>
-            <w:r>
-              <w:rPr>
-                <w:sz w:val="18"/>
-              </w:rPr>
-              <w:t>0.0000</w:t>
-            </w:r>
-            <w:r>
-              <w:t xml:space="preserve"> </w:t>
-            </w:r>
+              <w:t>0.4396</w:t>
+            </w:r>
+            <w:r/>
           </w:p>
         </w:tc>
       </w:tr>
     </w:tbl>
     <w:p>
-      <w:pPr>
-        <w:spacing w:after="136"/>
-        <w:ind w:left="-5"/>
-      </w:pPr>
-      <w:r>
-        <w:t xml:space="preserve">Evaluation metrics included Accuracy, Balanced Accuracy, Macro F1, Log Loss, and Brier Score. </w:t>
-      </w:r>
-      <w:r>
-        <w:t xml:space="preserve">Accuracy measures overall correctness. Balanced Accuracy gives equal importance to each class. Macro F1 balances precision and recall across the three risk classes. Log Loss and Brier Score assess the quality of probability predictions, where lower values </w:t>
-      </w:r>
-      <w:r>
-        <w:t xml:space="preserve">are better. </w:t>
+      <w:pPr/>
+      <w:r>
+        <w:t>*The USD final holdouts contained only Low-risk observations: 324 rows for 7 days and 323 rows for 14 days. Their 100% accuracy shows correct classification of that stable period, but it does not prove that the models distinguish all three risk classes.</w:t>
       </w:r>
     </w:p>
     <w:p>
@@ -4172,47 +3972,31 @@
         <w:pStyle w:val="Heading2"/>
       </w:pPr>
       <w:r>
-        <w:t>Evaluation caveat</w:t>
-      </w:r>
-      <w:r>
-        <w:rPr>
-          <w:b w:val="0"/>
-          <w:color w:val="000000"/>
-          <w:sz w:val="22"/>
-        </w:rPr>
-        <w:t xml:space="preserve"> </w:t>
+        <w:t>Automated Software Testing</w:t>
       </w:r>
     </w:p>
     <w:p>
-      <w:pPr>
-        <w:pBdr>
-          <w:top w:val="single" w:sz="8" w:space="0" w:color="DADCE0"/>
-          <w:left w:val="single" w:sz="8" w:space="0" w:color="DADCE0"/>
-          <w:bottom w:val="single" w:sz="8" w:space="0" w:color="DADCE0"/>
-          <w:right w:val="single" w:sz="8" w:space="0" w:color="DADCE0"/>
-        </w:pBdr>
-        <w:shd w:val="clear" w:color="auto" w:fill="F4F6F9"/>
-        <w:spacing w:after="94"/>
-        <w:ind w:left="120" w:firstLine="0"/>
-      </w:pPr>
-      <w:r>
-        <w:rPr>
-          <w:sz w:val="20"/>
-        </w:rPr>
-        <w:t>The most recent chronological test window contains only the Low class. Therefore, the perfect accuracy and Macro F1 in this specific window should not be treated as full proof that the model handles every risk condition. For</w:t>
-      </w:r>
-      <w:r>
-        <w:rPr>
-          <w:sz w:val="20"/>
-        </w:rPr>
-        <w:t xml:space="preserve"> a stronger evaluation, rolling-origin backtests and future unseen data should be used to test performance across periods with more class variation.</w:t>
-      </w:r>
-      <w:r>
-        <w:t xml:space="preserve"> </w:t>
+      <w:pPr/>
+      <w:r>
+        <w:t>All 26 automated software tests passed. They covered official BNR data validation, multicurrency API responses and predictions, Excel report generation, model output labels, forward-only backtest folds, purge gaps, final-holdout isolation, frontend structure, and account security foundations. Passing these tests shows that the tested software behaves as designed; it does not replace security auditing, legal review, production monitoring, or future model validation.</w:t>
       </w:r>
     </w:p>
     <w:p>
       <w:pPr>
+        <w:pStyle w:val="Heading2"/>
+      </w:pPr>
+      <w:r>
+        <w:t>Evaluation Conclusion</w:t>
+      </w:r>
+    </w:p>
+    <w:p>
+      <w:pPr/>
+      <w:r>
+        <w:t>The testing provides a more realistic assessment than the earlier single USD holdout. USD/RWF showed moderate historical signal, while EUR/RWF and KES/RWF remained close to the three-class reference level. FXGuard AI should therefore be described as a functioning and transparent experimental decision-support prototype, not as a guaranteed financial forecasting tool.</w:t>
+      </w:r>
+    </w:p>
+    <w:p>
+      <w:pPr>
         <w:spacing w:after="422" w:line="259" w:lineRule="auto"/>
         <w:ind w:left="0" w:firstLine="0"/>
       </w:pPr>
@@ -4226,7 +4010,7 @@
         <w:ind w:left="342" w:hanging="357"/>
       </w:pPr>
       <w:r>
-        <w:t xml:space="preserve">Why Logistic Regression Was Selected </w:t>
+        <w:t>Model Selection Outcome</w:t>
       </w:r>
     </w:p>
     <w:p>
@@ -4235,14 +4019,10 @@
         <w:ind w:left="-5"/>
       </w:pPr>
       <w:r>
-        <w:t>Logistic Regression was selected as the final MVP model because it</w:t>
-      </w:r>
-      <w:r>
-        <w:t xml:space="preserve"> achieved competitive headline performance while remaining simpler, faster, and easier to explain than Random Forest and XGBoost. For a decision-support system, interpretability matters because users and evaluators should understand why a risk class was re</w:t>
-      </w:r>
-      <w:r>
-        <w:t xml:space="preserve">turned. </w:t>
-      </w:r>
+        <w:t>Logistic Regression was selected for five of the six currency/horizon tasks. Random Forest was selected for EUR/RWF over 7 days. Selection used mean rolling balanced accuracy, followed by Macro F1 and accuracy; final holdout performance did not influence the choice.</w:t>
+      </w:r>
+      <w:r/>
+      <w:r/>
     </w:p>
     <w:p>
       <w:pPr>
@@ -4253,7 +4033,7 @@
         <w:ind w:hanging="360"/>
       </w:pPr>
       <w:r>
-        <w:t xml:space="preserve">It is easier to defend academically because feature influence can be explained more clearly. </w:t>
+        <w:t>USD/RWF produced the strongest historical result, with 7-day balanced accuracy of 0.5173. This indicates some useful historical signal, but not enough to treat individual predictions as certain.</w:t>
       </w:r>
     </w:p>
     <w:p>
@@ -4265,7 +4045,7 @@
         <w:ind w:hanging="360"/>
       </w:pPr>
       <w:r>
-        <w:t xml:space="preserve">It is faster and simpler to deploy inside a FastAPI backend. </w:t>
+        <w:t>EUR/RWF and KES/RWF were generally close to the one-third balanced-accuracy reference point for a three-class task, showing limited separation between Low, Medium, and High risk with the current features.</w:t>
       </w:r>
     </w:p>
     <w:p>
@@ -4277,7 +4057,7 @@
         <w:ind w:hanging="360"/>
       </w:pPr>
       <w:r>
-        <w:t xml:space="preserve">It produced strong results in the current training run. </w:t>
+        <w:t>XGBoost was not selected for any task. Greater algorithm complexity therefore did not overcome the main challenge of finding stable short-term patterns in the available exchange-rate history.</w:t>
       </w:r>
     </w:p>
     <w:p>
@@ -4290,11 +4070,9 @@
         <w:ind w:hanging="360"/>
       </w:pPr>
       <w:r>
-        <w:t>It is appropriate for the MVP beca</w:t>
-      </w:r>
-      <w:r>
-        <w:t xml:space="preserve">use complex models did not show a clear practical advantage in the current comparison. </w:t>
-      </w:r>
+        <w:t>The results support an experimental decision-support prototype rather than a guaranteed forecasting system. Predictions should be considered alongside the user's business context and other financial information.</w:t>
+      </w:r>
+      <w:r/>
     </w:p>
     <w:p>
       <w:pPr>
@@ -4638,11 +4416,9 @@
         <w:ind w:left="-5"/>
       </w:pPr>
       <w:r>
-        <w:t xml:space="preserve">For example, if a 10,000 USD payment receives Low </w:t>
-      </w:r>
-      <w:r>
-        <w:t xml:space="preserve">risk with 92% confidence, the app displays Low as the main result and also shows the probability distribution. This makes the prediction more transparent than a single black-box label. </w:t>
-      </w:r>
+        <w:t>For example, if a selected foreign-currency payment receives Low risk with 92% model confidence, the application displays Low and the full probability distribution. This is more transparent than displaying only a single label, but the score is not a guaranteed real-world probability.</w:t>
+      </w:r>
+      <w:r/>
     </w:p>
     <w:p>
       <w:pPr>
@@ -4662,11 +4438,9 @@
         <w:ind w:hanging="360"/>
       </w:pPr>
       <w:r>
-        <w:t>The dashboard shows the latest USD/</w:t>
-      </w:r>
-      <w:r>
-        <w:t xml:space="preserve">RWF rate and data freshness. </w:t>
-      </w:r>
+        <w:t>The dashboard shows the latest official rate and data freshness for the selected USD, EUR, or KES currency pair.</w:t>
+      </w:r>
+      <w:r/>
     </w:p>
     <w:p>
       <w:pPr>
@@ -4677,7 +4451,7 @@
         <w:ind w:hanging="360"/>
       </w:pPr>
       <w:r>
-        <w:t xml:space="preserve">The user opens Payment Check and enters a supplier invoice amount in USD. </w:t>
+        <w:t>The user opens Payment Check, selects the supplier-payment currency, and enters the invoice amount.</w:t>
       </w:r>
     </w:p>
     <w:p>
@@ -4740,7 +4514,7 @@
         <w:ind w:hanging="360"/>
       </w:pPr>
       <w:r>
-        <w:t xml:space="preserve">The app calculates estimated RWF cost and possible extra cost. </w:t>
+        <w:t>The application calculates the estimated RWF cost and a possible additional cost for the selected currency.</w:t>
       </w:r>
     </w:p>
     <w:p>
@@ -4954,9 +4728,7 @@
               </w:rPr>
               <w:t>Assumption 2</w:t>
             </w:r>
-            <w:r>
-              <w:t xml:space="preserve"> </w:t>
-            </w:r>
+            <w:r/>
           </w:p>
         </w:tc>
         <w:tc>
@@ -4979,17 +4751,14 @@
               <w:rPr>
                 <w:sz w:val="18"/>
               </w:rPr>
-              <w:t>USD/RWF is a useful MVP scope because many importers pay</w:t>
-            </w:r>
-            <w:r>
-              <w:rPr>
-                <w:sz w:val="18"/>
-              </w:rPr>
-              <w:t xml:space="preserve"> suppliers in USD.</w:t>
-            </w:r>
-            <w:r>
-              <w:t xml:space="preserve"> </w:t>
-            </w:r>
+              <w:t>USD, EUR, and KES represent useful supplier-payment currencies for the current prototype.</w:t>
+            </w:r>
+            <w:r>
+              <w:rPr>
+                <w:sz w:val="18"/>
+              </w:rPr>
+            </w:r>
+            <w:r/>
           </w:p>
         </w:tc>
       </w:tr>
@@ -5081,9 +4850,7 @@
               </w:rPr>
               <w:t>Limitation 1</w:t>
             </w:r>
-            <w:r>
-              <w:t xml:space="preserve"> </w:t>
-            </w:r>
+            <w:r/>
           </w:p>
         </w:tc>
         <w:tc>
@@ -5106,11 +4873,9 @@
               <w:rPr>
                 <w:sz w:val="18"/>
               </w:rPr>
-              <w:t>The current MVP supports USD/RWF only.</w:t>
-            </w:r>
-            <w:r>
-              <w:t xml:space="preserve"> </w:t>
-            </w:r>
+              <w:t>The current prototype supports USD, EUR, and KES only, rather than every currency used by Rwanda-based importers.</w:t>
+            </w:r>
+            <w:r/>
           </w:p>
         </w:tc>
       </w:tr>
@@ -5142,9 +4907,7 @@
               </w:rPr>
               <w:t>Limitation 2</w:t>
             </w:r>
-            <w:r>
-              <w:t xml:space="preserve"> </w:t>
-            </w:r>
+            <w:r/>
           </w:p>
         </w:tc>
         <w:tc>
@@ -5167,17 +4930,14 @@
               <w:rPr>
                 <w:sz w:val="18"/>
               </w:rPr>
-              <w:t xml:space="preserve">The latest chronological test window contains only the Low </w:t>
-            </w:r>
-            <w:r>
-              <w:rPr>
-                <w:sz w:val="18"/>
-              </w:rPr>
-              <w:t>class, so more diverse backtesting is required.</w:t>
-            </w:r>
-            <w:r>
-              <w:t xml:space="preserve"> </w:t>
-            </w:r>
+              <w:t>Backtest performance is mixed, and the final USD holdout contains only the Low class.</w:t>
+            </w:r>
+            <w:r>
+              <w:rPr>
+                <w:sz w:val="18"/>
+              </w:rPr>
+            </w:r>
+            <w:r/>
           </w:p>
         </w:tc>
       </w:tr>
@@ -5209,9 +4969,7 @@
               </w:rPr>
               <w:t>Limitation 3</w:t>
             </w:r>
-            <w:r>
-              <w:t xml:space="preserve"> </w:t>
-            </w:r>
+            <w:r/>
           </w:p>
         </w:tc>
         <w:tc>
@@ -5234,11 +4992,9 @@
               <w:rPr>
                 <w:sz w:val="18"/>
               </w:rPr>
-              <w:t>The tool is decision support, not guaranteed financial advice or forex trading advice.</w:t>
-            </w:r>
-            <w:r>
-              <w:t xml:space="preserve"> </w:t>
-            </w:r>
+              <w:t>The tool provides experimental decision support, not guaranteed financial, forex-trading, or professional advice.</w:t>
+            </w:r>
+            <w:r/>
           </w:p>
         </w:tc>
       </w:tr>
@@ -5270,9 +5026,7 @@
               </w:rPr>
               <w:t>Future work</w:t>
             </w:r>
-            <w:r>
-              <w:t xml:space="preserve"> </w:t>
-            </w:r>
+            <w:r/>
           </w:p>
         </w:tc>
         <w:tc>
@@ -5295,17 +5049,14 @@
               <w:rPr>
                 <w:sz w:val="18"/>
               </w:rPr>
-              <w:t xml:space="preserve">Add EUR, GBP, KES, UGX, and CNY; automate dataset refresh; retrain periodically; improve </w:t>
-            </w:r>
-            <w:r>
-              <w:rPr>
-                <w:sz w:val="18"/>
-              </w:rPr>
-              <w:t>probability calibration and user alerts.</w:t>
-            </w:r>
-            <w:r>
-              <w:t xml:space="preserve"> </w:t>
-            </w:r>
+              <w:t>Add macroeconomic features, live outcome monitoring, probability calibration, more currencies, scheduled data refresh, and repeated future validation.</w:t>
+            </w:r>
+            <w:r>
+              <w:rPr>
+                <w:sz w:val="18"/>
+              </w:rPr>
+            </w:r>
+            <w:r/>
           </w:p>
         </w:tc>
       </w:tr>

</xml_diff>

<commit_message>
Switching from fixed horizons to accommodate different invoice dates inputs, canceling forward fill and improving model performance
</commit_message>
<xml_diff>
--- a/FXGuard_AI_Technical_Report_converted.docx
+++ b/FXGuard_AI_Technical_Report_converted.docx
@@ -121,7 +121,7 @@
         <w:ind w:left="-5"/>
       </w:pPr>
       <w:r>
-        <w:t>Many importers in Rwanda earn revenue in Rwandan francs but pay international suppliers in foreign currencies. When the Rwandan franc weakens before a supplier payment date, the same invoice becomes more expensive in RWF. FXGuard AI addresses this problem by converting historical exchange-rate behaviour into an interpretable risk classification.</w:t>
+        <w:t>Rwanda-based importers that earn RWF and owe foreign-currency supplier payments face uncertain RWF costs when rates move before settlement. FXGuard AI investigates whether short-term risk classification can add payment-planning support. It does not stop depreciation, hedge exposure, or resolve the underlying financial risk.</w:t>
       </w:r>
       <w:r/>
       <w:r/>
@@ -131,7 +131,7 @@
         <w:ind w:left="-5"/>
       </w:pPr>
       <w:r>
-        <w:t>FXGuard AI is a web-based decision-support prototype for Rwanda-based importers. It uses official USD/RWF, EUR/RWF, and KES/RWF exchange-rate history, engineered time-series features, and separate classifiers to estimate Low, Medium, or High depreciation risk over a 7-day or 14-day horizon.</w:t>
+        <w:t>FXGuard AI is an experimental web-based decision-support prototype. It uses official USD/RWF, EUR/RWF, and KES/RWF histories and the user's invoice payment date to classify 1-to-100-day depreciation pressure as Low, Medium, or High.</w:t>
       </w:r>
       <w:r/>
     </w:p>
@@ -424,7 +424,7 @@
               <w:rPr>
                 <w:sz w:val="18"/>
               </w:rPr>
-              <w:t>USD, EUR, and KES against RWF; official BNR history; 7-day and 14-day horizons; FastAPI backend; web frontend.</w:t>
+              <w:t>USD, EUR, and KES against RWF; user-selected payment dates 1–100 days ahead; FastAPI backend; web frontend.</w:t>
             </w:r>
             <w:r>
               <w:rPr>
@@ -483,7 +483,7 @@
               <w:rPr>
                 <w:sz w:val="18"/>
               </w:rPr>
-              <w:t>Risk class, probability distribution, model-confidence score, current RWF cost, possible extra cost, key drivers, and recommendations.</w:t>
+              <w:t>Experimental risk class, uncalibrated model scores, RWF cost scenario, drivers, and planning considerations.</w:t>
             </w:r>
             <w:r/>
           </w:p>
@@ -513,7 +513,7 @@
         <w:ind w:left="-5"/>
       </w:pPr>
       <w:r>
-        <w:t>The current multicurrency dataset was prepared from official National Bank of Rwanda exchange-rate exports for USD, EUR, and KES. Each currency has a continuous daily calendar, engineered features, future risk labels, and separate 7-day and 14-day model-ready datasets.</w:t>
+        <w:t>The model dataset uses actual BNR posting rows only. A forward-filled daily calendar remains available for charts, but weekends and other non-posting dates are excluded from model training.</w:t>
       </w:r>
       <w:r/>
     </w:p>
@@ -858,7 +858,7 @@
               <w:rPr>
                 <w:sz w:val="18"/>
               </w:rPr>
-              <w:t>Daily calendar, mid-rate, engineered features, and currency-specific 7-day and 14-day labels.</w:t>
+              <w:t>Official-posting observations, engineered rate-history features, horizon_days, and horizon-specific 1-to-100-day labels.</w:t>
             </w:r>
             <w:r/>
           </w:p>
@@ -912,7 +912,7 @@
               <w:rPr>
                 <w:sz w:val="18"/>
               </w:rPr>
-              <w:t>Missing non-posting days were forward-filled within each currency's own history; no values were created before its first official observation.</w:t>
+              <w:t>Forward-filled dates are retained for charts only; model training uses actual BNR postings.</w:t>
             </w:r>
             <w:r/>
           </w:p>
@@ -1204,7 +1204,7 @@
         <w:ind w:left="-5"/>
       </w:pPr>
       <w:r>
-        <w:t>Labels are created by looking ahead within each currency's historical series. A 7-day label compares the current mid-rate with the rate seven days later; a 14-day label uses fourteen days later. The resulting RWF depreciation is converted into Low, Medium, or High risk using currency-specific thresholds.</w:t>
+        <w:t>Every integer horizon from 1 to 100 days uses the first official BNR posting on or after its calendar target date. Within evaluation, Low, Medium, and High thresholds are derived separately for every horizon from the earlier training window only.</w:t>
       </w:r>
       <w:r/>
     </w:p>
@@ -2374,7 +2374,7 @@
               <w:rPr>
                 <w:sz w:val="18"/>
               </w:rPr>
-              <w:t>Loads the currency- and horizon-specific model and returns a risk class and probabilities.</w:t>
+              <w:t>Loads one horizon-aware model for the selected currency and predicts from the latest features plus horizon_days.</w:t>
             </w:r>
             <w:r>
               <w:rPr>
@@ -2541,7 +2541,7 @@
               <w:rPr>
                 <w:sz w:val="18"/>
               </w:rPr>
-              <w:t>Receives currency, amount, and horizon and returns risk, likelihood scores, cost estimates, drivers, and recommendations.</w:t>
+              <w:t>Receives currency, amount, and payment_date; validates 1–100 days; returns experimental risk classification, approximate uncalibrated scores, reliability status, cost estimates, and planning considerations.</w:t>
             </w:r>
             <w:r/>
           </w:p>
@@ -2630,7 +2630,7 @@
         <w:ind w:left="-5"/>
       </w:pPr>
       <w:r>
-        <w:t>Logistic Regression, Random Forest, and XGBoost were compared independently for USD, EUR, and KES over both 7-day and 14-day horizons. Model selection was based on time-aware historical backtesting rather than the final holdout.</w:t>
+        <w:t>Logistic Regression, Random Forest, and XGBoost were compared independently for USD, EUR, and KES across the full 1-to-100-day horizon surface. Model selection was based on time-aware historical backtesting rather than the final holdout.</w:t>
       </w:r>
       <w:r/>
     </w:p>
@@ -2676,7 +2676,7 @@
         <w:rPr>
           <w:sz w:val="20"/>
         </w:rPr>
-        <w:t>Three expanding-window rolling-origin folds were used for every currency and horizon. In each fold, the model learned from an earlier period and was tested on the following 10% of observations. All folds stayed within the first 80% of the timeline, while the final 20% remained excluded from model selection. A 7-row or 14-row purge gap separated training and testing so labels derived from future rates could not cross the boundary. After selection and holdout evaluation, the winning production model was refitted on all labeled history.</w:t>
+        <w:t>Three expanding rolling-origin folds were used for every currency and the full 1-to-100-day horizon surface. Training rows whose future outcome date reached the following test period were purged, creating up to a 100-day boundary gap.</w:t>
       </w:r>
       <w:r>
         <w:rPr>
@@ -2760,7 +2760,7 @@
                 <w:b/>
                 <w:sz w:val="18"/>
               </w:rPr>
-              <w:t>Horizon</w:t>
+              <w:t>Period</w:t>
             </w:r>
             <w:r/>
           </w:p>
@@ -2948,7 +2948,7 @@
               <w:rPr>
                 <w:sz w:val="18"/>
               </w:rPr>
-              <w:t>7-day</w:t>
+              <w:t>1–100 days</w:t>
             </w:r>
           </w:p>
         </w:tc>
@@ -2997,7 +2997,7 @@
               <w:rPr>
                 <w:sz w:val="18"/>
               </w:rPr>
-              <w:t>0.5473</w:t>
+              <w:t>0.6386</w:t>
             </w:r>
             <w:r/>
           </w:p>
@@ -3022,7 +3022,7 @@
               <w:rPr>
                 <w:sz w:val="18"/>
               </w:rPr>
-              <w:t>0.5173</w:t>
+              <w:t>0.4472</w:t>
             </w:r>
             <w:r/>
           </w:p>
@@ -3047,7 +3047,7 @@
               <w:rPr>
                 <w:sz w:val="18"/>
               </w:rPr>
-              <w:t>0.4474</w:t>
+              <w:t>0.2801</w:t>
             </w:r>
             <w:r/>
           </w:p>
@@ -3102,7 +3102,7 @@
               <w:rPr>
                 <w:sz w:val="18"/>
               </w:rPr>
-              <w:t>USD/RWF</w:t>
+              <w:t>EUR/RWF</w:t>
             </w:r>
             <w:r/>
           </w:p>
@@ -3126,7 +3126,7 @@
               <w:rPr>
                 <w:sz w:val="18"/>
               </w:rPr>
-              <w:t>14-day</w:t>
+              <w:t>1–100 days</w:t>
             </w:r>
             <w:r/>
           </w:p>
@@ -3151,7 +3151,7 @@
               <w:rPr>
                 <w:sz w:val="18"/>
               </w:rPr>
-              <w:t>Logistic Regression</w:t>
+              <w:t>XGBoost</w:t>
             </w:r>
             <w:r/>
           </w:p>
@@ -3176,7 +3176,7 @@
               <w:rPr>
                 <w:sz w:val="18"/>
               </w:rPr>
-              <w:t>0.5963</w:t>
+              <w:t>0.3084</w:t>
             </w:r>
             <w:r/>
           </w:p>
@@ -3201,7 +3201,7 @@
               <w:rPr>
                 <w:sz w:val="18"/>
               </w:rPr>
-              <w:t>0.4420</w:t>
+              <w:t>0.2987</w:t>
             </w:r>
             <w:r/>
           </w:p>
@@ -3226,7 +3226,7 @@
               <w:rPr>
                 <w:sz w:val="18"/>
               </w:rPr>
-              <w:t>0.4044</w:t>
+              <w:t>0.1680</w:t>
             </w:r>
             <w:r/>
           </w:p>
@@ -3251,7 +3251,7 @@
               <w:rPr>
                 <w:sz w:val="18"/>
               </w:rPr>
-              <w:t>1.0000*</w:t>
+              <w:t>0.8164</w:t>
             </w:r>
             <w:r/>
           </w:p>
@@ -3280,7 +3280,7 @@
               <w:rPr>
                 <w:sz w:val="18"/>
               </w:rPr>
-              <w:t>EUR/RWF</w:t>
+              <w:t>KES/RWF</w:t>
             </w:r>
             <w:r/>
           </w:p>
@@ -3304,7 +3304,7 @@
               <w:rPr>
                 <w:sz w:val="18"/>
               </w:rPr>
-              <w:t>7-day</w:t>
+              <w:t>1–100 days</w:t>
             </w:r>
             <w:r/>
           </w:p>
@@ -3352,7 +3352,7 @@
               <w:rPr>
                 <w:sz w:val="18"/>
               </w:rPr>
-              <w:t>0.4136</w:t>
+              <w:t>0.4982</w:t>
             </w:r>
             <w:r/>
           </w:p>
@@ -3376,7 +3376,7 @@
               <w:rPr>
                 <w:sz w:val="18"/>
               </w:rPr>
-              <w:t>0.3462</w:t>
+              <w:t>0.4016</w:t>
             </w:r>
             <w:r/>
           </w:p>
@@ -3400,7 +3400,7 @@
               <w:rPr>
                 <w:sz w:val="18"/>
               </w:rPr>
-              <w:t>0.2667</w:t>
+              <w:t>0.2470</w:t>
             </w:r>
             <w:r/>
           </w:p>
@@ -3424,537 +3424,7 @@
               <w:rPr>
                 <w:sz w:val="18"/>
               </w:rPr>
-              <w:t>0.4691</w:t>
-            </w:r>
-            <w:r/>
-          </w:p>
-        </w:tc>
-      </w:tr>
-      <w:tr>
-        <w:trPr>
-          <w:trHeight w:val="500"/>
-        </w:trPr>
-        <w:tc>
-          <w:tcPr>
-            <w:tcW w:w="1323" w:type="dxa"/>
-            <w:tcBorders>
-              <w:top w:val="single" w:sz="8" w:space="0" w:color="DADCE0"/>
-              <w:left w:val="single" w:sz="8" w:space="0" w:color="DADCE0"/>
-              <w:bottom w:val="single" w:sz="8" w:space="0" w:color="DADCE0"/>
-              <w:right w:val="single" w:sz="8" w:space="0" w:color="DADCE0"/>
-            </w:tcBorders>
-            <w:vAlign w:val="center"/>
-          </w:tcPr>
-          <w:p>
-            <w:pPr>
-              <w:spacing w:after="0" w:line="259" w:lineRule="auto"/>
-              <w:ind w:left="3" w:firstLine="0"/>
-            </w:pPr>
-            <w:r>
-              <w:rPr>
-                <w:sz w:val="18"/>
-              </w:rPr>
-              <w:t>EUR/RWF</w:t>
-            </w:r>
-            <w:r/>
-          </w:p>
-        </w:tc>
-        <w:tc>
-          <w:tcPr>
-            <w:tcW w:w="1340" w:type="dxa"/>
-            <w:tcBorders>
-              <w:top w:val="single" w:sz="8" w:space="0" w:color="DADCE0"/>
-              <w:left w:val="single" w:sz="8" w:space="0" w:color="DADCE0"/>
-              <w:bottom w:val="single" w:sz="8" w:space="0" w:color="DADCE0"/>
-              <w:right w:val="single" w:sz="8" w:space="0" w:color="DADCE0"/>
-            </w:tcBorders>
-          </w:tcPr>
-          <w:p>
-            <w:pPr>
-              <w:spacing w:after="41" w:line="259" w:lineRule="auto"/>
-              <w:ind w:left="15" w:firstLine="0"/>
-            </w:pPr>
-            <w:r>
-              <w:rPr>
-                <w:sz w:val="18"/>
-              </w:rPr>
-              <w:t>14-day</w:t>
-            </w:r>
-          </w:p>
-        </w:tc>
-        <w:tc>
-          <w:tcPr>
-            <w:tcW w:w="1340" w:type="dxa"/>
-            <w:tcBorders>
-              <w:top w:val="single" w:sz="8" w:space="0" w:color="DADCE0"/>
-              <w:left w:val="single" w:sz="8" w:space="0" w:color="DADCE0"/>
-              <w:bottom w:val="single" w:sz="8" w:space="0" w:color="DADCE0"/>
-              <w:right w:val="single" w:sz="8" w:space="0" w:color="DADCE0"/>
-            </w:tcBorders>
-            <w:vAlign w:val="center"/>
-          </w:tcPr>
-          <w:p>
-            <w:pPr>
-              <w:spacing w:after="0" w:line="259" w:lineRule="auto"/>
-              <w:ind w:firstLine="0"/>
-            </w:pPr>
-            <w:r>
-              <w:rPr>
-                <w:sz w:val="18"/>
-              </w:rPr>
-              <w:t>Logistic Regression</w:t>
-            </w:r>
-            <w:r/>
-          </w:p>
-        </w:tc>
-        <w:tc>
-          <w:tcPr>
-            <w:tcW w:w="1340" w:type="dxa"/>
-            <w:tcBorders>
-              <w:top w:val="single" w:sz="8" w:space="0" w:color="DADCE0"/>
-              <w:left w:val="single" w:sz="8" w:space="0" w:color="DADCE0"/>
-              <w:bottom w:val="single" w:sz="8" w:space="0" w:color="DADCE0"/>
-              <w:right w:val="single" w:sz="8" w:space="0" w:color="DADCE0"/>
-            </w:tcBorders>
-            <w:vAlign w:val="center"/>
-          </w:tcPr>
-          <w:p>
-            <w:pPr>
-              <w:spacing w:after="0" w:line="259" w:lineRule="auto"/>
-              <w:ind w:left="5" w:firstLine="0"/>
-            </w:pPr>
-            <w:r>
-              <w:rPr>
-                <w:sz w:val="18"/>
-              </w:rPr>
-              <w:t>0.3333</w:t>
-            </w:r>
-            <w:r/>
-          </w:p>
-        </w:tc>
-        <w:tc>
-          <w:tcPr>
-            <w:tcW w:w="1320" w:type="dxa"/>
-            <w:tcBorders>
-              <w:top w:val="single" w:sz="8" w:space="0" w:color="DADCE0"/>
-              <w:left w:val="single" w:sz="8" w:space="0" w:color="DADCE0"/>
-              <w:bottom w:val="single" w:sz="8" w:space="0" w:color="DADCE0"/>
-              <w:right w:val="single" w:sz="8" w:space="0" w:color="DADCE0"/>
-            </w:tcBorders>
-            <w:vAlign w:val="center"/>
-          </w:tcPr>
-          <w:p>
-            <w:pPr>
-              <w:spacing w:after="0" w:line="259" w:lineRule="auto"/>
-              <w:ind w:left="0" w:firstLine="0"/>
-            </w:pPr>
-            <w:r>
-              <w:rPr>
-                <w:sz w:val="18"/>
-              </w:rPr>
-              <w:t>0.3323</w:t>
-            </w:r>
-            <w:r/>
-          </w:p>
-        </w:tc>
-        <w:tc>
-          <w:tcPr>
-            <w:tcW w:w="1340" w:type="dxa"/>
-            <w:tcBorders>
-              <w:top w:val="single" w:sz="8" w:space="0" w:color="DADCE0"/>
-              <w:left w:val="single" w:sz="8" w:space="0" w:color="DADCE0"/>
-              <w:bottom w:val="single" w:sz="8" w:space="0" w:color="DADCE0"/>
-              <w:right w:val="single" w:sz="8" w:space="0" w:color="DADCE0"/>
-            </w:tcBorders>
-            <w:vAlign w:val="center"/>
-          </w:tcPr>
-          <w:p>
-            <w:pPr>
-              <w:spacing w:after="0" w:line="259" w:lineRule="auto"/>
-              <w:ind w:left="15" w:firstLine="0"/>
-            </w:pPr>
-            <w:r>
-              <w:rPr>
-                <w:sz w:val="18"/>
-              </w:rPr>
-              <w:t>0.2376</w:t>
-            </w:r>
-            <w:r/>
-          </w:p>
-        </w:tc>
-        <w:tc>
-          <w:tcPr>
-            <w:tcW w:w="1340" w:type="dxa"/>
-            <w:tcBorders>
-              <w:top w:val="single" w:sz="8" w:space="0" w:color="DADCE0"/>
-              <w:left w:val="single" w:sz="8" w:space="0" w:color="DADCE0"/>
-              <w:bottom w:val="single" w:sz="8" w:space="0" w:color="DADCE0"/>
-              <w:right w:val="single" w:sz="8" w:space="0" w:color="DADCE0"/>
-            </w:tcBorders>
-            <w:vAlign w:val="center"/>
-          </w:tcPr>
-          <w:p>
-            <w:pPr>
-              <w:spacing w:after="0" w:line="259" w:lineRule="auto"/>
-              <w:ind w:firstLine="0"/>
-            </w:pPr>
-            <w:r>
-              <w:rPr>
-                <w:sz w:val="18"/>
-              </w:rPr>
-              <w:t>0.6285</w:t>
-            </w:r>
-            <w:r/>
-          </w:p>
-        </w:tc>
-      </w:tr>
-      <w:tr>
-        <w:trPr>
-          <w:trHeight w:val="500"/>
-        </w:trPr>
-        <w:tc>
-          <w:tcPr>
-            <w:tcW w:w="1323" w:type="dxa"/>
-            <w:tcBorders>
-              <w:top w:val="single" w:sz="8" w:space="0" w:color="DADCE0"/>
-              <w:left w:val="single" w:sz="8" w:space="0" w:color="DADCE0"/>
-              <w:bottom w:val="single" w:sz="8" w:space="0" w:color="DADCE0"/>
-              <w:right w:val="single" w:sz="8" w:space="0" w:color="DADCE0"/>
-            </w:tcBorders>
-            <w:vAlign w:val="center"/>
-          </w:tcPr>
-          <w:p>
-            <w:pPr>
-              <w:spacing w:after="0" w:line="259" w:lineRule="auto"/>
-              <w:ind w:left="3" w:firstLine="0"/>
-            </w:pPr>
-            <w:r>
-              <w:rPr>
-                <w:sz w:val="18"/>
-              </w:rPr>
-              <w:t>KES/RWF</w:t>
-            </w:r>
-            <w:r/>
-          </w:p>
-        </w:tc>
-        <w:tc>
-          <w:tcPr>
-            <w:tcW w:w="1340" w:type="dxa"/>
-            <w:tcBorders>
-              <w:top w:val="single" w:sz="8" w:space="0" w:color="DADCE0"/>
-              <w:left w:val="single" w:sz="8" w:space="0" w:color="DADCE0"/>
-              <w:bottom w:val="single" w:sz="8" w:space="0" w:color="DADCE0"/>
-              <w:right w:val="single" w:sz="8" w:space="0" w:color="DADCE0"/>
-            </w:tcBorders>
-          </w:tcPr>
-          <w:p>
-            <w:pPr>
-              <w:spacing w:after="0" w:line="259" w:lineRule="auto"/>
-              <w:ind w:left="15" w:firstLine="0"/>
-            </w:pPr>
-            <w:r>
-              <w:rPr>
-                <w:sz w:val="18"/>
-              </w:rPr>
-              <w:t>7-day</w:t>
-            </w:r>
-            <w:r/>
-          </w:p>
-        </w:tc>
-        <w:tc>
-          <w:tcPr>
-            <w:tcW w:w="1340" w:type="dxa"/>
-            <w:tcBorders>
-              <w:top w:val="single" w:sz="8" w:space="0" w:color="DADCE0"/>
-              <w:left w:val="single" w:sz="8" w:space="0" w:color="DADCE0"/>
-              <w:bottom w:val="single" w:sz="8" w:space="0" w:color="DADCE0"/>
-              <w:right w:val="single" w:sz="8" w:space="0" w:color="DADCE0"/>
-            </w:tcBorders>
-            <w:vAlign w:val="center"/>
-          </w:tcPr>
-          <w:p>
-            <w:pPr>
-              <w:spacing w:after="0" w:line="259" w:lineRule="auto"/>
-              <w:ind w:firstLine="0"/>
-            </w:pPr>
-            <w:r>
-              <w:rPr>
-                <w:sz w:val="18"/>
-              </w:rPr>
-              <w:t>Logistic Regression</w:t>
-            </w:r>
-            <w:r/>
-          </w:p>
-        </w:tc>
-        <w:tc>
-          <w:tcPr>
-            <w:tcW w:w="1340" w:type="dxa"/>
-            <w:tcBorders>
-              <w:top w:val="single" w:sz="8" w:space="0" w:color="DADCE0"/>
-              <w:left w:val="single" w:sz="8" w:space="0" w:color="DADCE0"/>
-              <w:bottom w:val="single" w:sz="8" w:space="0" w:color="DADCE0"/>
-              <w:right w:val="single" w:sz="8" w:space="0" w:color="DADCE0"/>
-            </w:tcBorders>
-            <w:vAlign w:val="center"/>
-          </w:tcPr>
-          <w:p>
-            <w:pPr>
-              <w:spacing w:after="0" w:line="259" w:lineRule="auto"/>
-              <w:ind w:left="5" w:firstLine="0"/>
-            </w:pPr>
-            <w:r>
-              <w:rPr>
-                <w:sz w:val="18"/>
-              </w:rPr>
-              <w:t>0.4177</w:t>
-            </w:r>
-            <w:r/>
-          </w:p>
-        </w:tc>
-        <w:tc>
-          <w:tcPr>
-            <w:tcW w:w="1320" w:type="dxa"/>
-            <w:tcBorders>
-              <w:top w:val="single" w:sz="8" w:space="0" w:color="DADCE0"/>
-              <w:left w:val="single" w:sz="8" w:space="0" w:color="DADCE0"/>
-              <w:bottom w:val="single" w:sz="8" w:space="0" w:color="DADCE0"/>
-              <w:right w:val="single" w:sz="8" w:space="0" w:color="DADCE0"/>
-            </w:tcBorders>
-            <w:vAlign w:val="center"/>
-          </w:tcPr>
-          <w:p>
-            <w:pPr>
-              <w:spacing w:after="0" w:line="259" w:lineRule="auto"/>
-              <w:ind w:left="0" w:firstLine="0"/>
-            </w:pPr>
-            <w:r>
-              <w:rPr>
-                <w:sz w:val="18"/>
-              </w:rPr>
-              <w:t>0.3555</w:t>
-            </w:r>
-            <w:r/>
-          </w:p>
-        </w:tc>
-        <w:tc>
-          <w:tcPr>
-            <w:tcW w:w="1340" w:type="dxa"/>
-            <w:tcBorders>
-              <w:top w:val="single" w:sz="8" w:space="0" w:color="DADCE0"/>
-              <w:left w:val="single" w:sz="8" w:space="0" w:color="DADCE0"/>
-              <w:bottom w:val="single" w:sz="8" w:space="0" w:color="DADCE0"/>
-              <w:right w:val="single" w:sz="8" w:space="0" w:color="DADCE0"/>
-            </w:tcBorders>
-            <w:vAlign w:val="center"/>
-          </w:tcPr>
-          <w:p>
-            <w:pPr>
-              <w:spacing w:after="0" w:line="259" w:lineRule="auto"/>
-              <w:ind w:left="15" w:firstLine="0"/>
-            </w:pPr>
-            <w:r>
-              <w:rPr>
-                <w:sz w:val="18"/>
-              </w:rPr>
-              <w:t>0.2283</w:t>
-            </w:r>
-            <w:r/>
-          </w:p>
-        </w:tc>
-        <w:tc>
-          <w:tcPr>
-            <w:tcW w:w="1340" w:type="dxa"/>
-            <w:tcBorders>
-              <w:top w:val="single" w:sz="8" w:space="0" w:color="DADCE0"/>
-              <w:left w:val="single" w:sz="8" w:space="0" w:color="DADCE0"/>
-              <w:bottom w:val="single" w:sz="8" w:space="0" w:color="DADCE0"/>
-              <w:right w:val="single" w:sz="8" w:space="0" w:color="DADCE0"/>
-            </w:tcBorders>
-            <w:vAlign w:val="center"/>
-          </w:tcPr>
-          <w:p>
-            <w:pPr>
-              <w:spacing w:after="0" w:line="259" w:lineRule="auto"/>
-              <w:ind w:firstLine="0"/>
-            </w:pPr>
-            <w:r>
-              <w:rPr>
-                <w:sz w:val="18"/>
-              </w:rPr>
-              <w:t>0.4815</w:t>
-            </w:r>
-            <w:r/>
-          </w:p>
-        </w:tc>
-      </w:tr>
-      <w:tr>
-        <w:trPr>
-          <w:trHeight w:val="260"/>
-        </w:trPr>
-        <w:tc>
-          <w:tcPr>
-            <w:tcW w:w="1323" w:type="dxa"/>
-            <w:tcBorders>
-              <w:top w:val="single" w:sz="8" w:space="0" w:color="DADCE0"/>
-              <w:left w:val="single" w:sz="8" w:space="0" w:color="DADCE0"/>
-              <w:bottom w:val="single" w:sz="8" w:space="0" w:color="DADCE0"/>
-              <w:right w:val="single" w:sz="8" w:space="0" w:color="DADCE0"/>
-            </w:tcBorders>
-          </w:tcPr>
-          <w:p>
-            <w:pPr>
-              <w:spacing w:after="0" w:line="259" w:lineRule="auto"/>
-              <w:ind w:left="3" w:firstLine="0"/>
-            </w:pPr>
-            <w:r>
-              <w:rPr>
-                <w:sz w:val="18"/>
-              </w:rPr>
-              <w:t>KES/RWF</w:t>
-            </w:r>
-            <w:r/>
-          </w:p>
-        </w:tc>
-        <w:tc>
-          <w:tcPr>
-            <w:tcW w:w="1340" w:type="dxa"/>
-            <w:tcBorders>
-              <w:top w:val="single" w:sz="8" w:space="0" w:color="DADCE0"/>
-              <w:left w:val="single" w:sz="8" w:space="0" w:color="DADCE0"/>
-              <w:bottom w:val="single" w:sz="8" w:space="0" w:color="DADCE0"/>
-              <w:right w:val="single" w:sz="8" w:space="0" w:color="DADCE0"/>
-            </w:tcBorders>
-          </w:tcPr>
-          <w:p>
-            <w:pPr>
-              <w:spacing w:after="0" w:line="259" w:lineRule="auto"/>
-              <w:ind w:left="15" w:firstLine="0"/>
-            </w:pPr>
-            <w:r>
-              <w:rPr>
-                <w:sz w:val="18"/>
-              </w:rPr>
-              <w:t>14-day</w:t>
-            </w:r>
-            <w:r/>
-          </w:p>
-        </w:tc>
-        <w:tc>
-          <w:tcPr>
-            <w:tcW w:w="1340" w:type="dxa"/>
-            <w:tcBorders>
-              <w:top w:val="single" w:sz="8" w:space="0" w:color="DADCE0"/>
-              <w:left w:val="single" w:sz="8" w:space="0" w:color="DADCE0"/>
-              <w:bottom w:val="single" w:sz="8" w:space="0" w:color="DADCE0"/>
-              <w:right w:val="single" w:sz="8" w:space="0" w:color="DADCE0"/>
-            </w:tcBorders>
-          </w:tcPr>
-          <w:p>
-            <w:pPr>
-              <w:spacing w:after="0" w:line="259" w:lineRule="auto"/>
-              <w:ind w:firstLine="0"/>
-            </w:pPr>
-            <w:r>
-              <w:rPr>
-                <w:sz w:val="18"/>
-              </w:rPr>
-              <w:t>Logistic Regression</w:t>
-            </w:r>
-            <w:r/>
-          </w:p>
-        </w:tc>
-        <w:tc>
-          <w:tcPr>
-            <w:tcW w:w="1340" w:type="dxa"/>
-            <w:tcBorders>
-              <w:top w:val="single" w:sz="8" w:space="0" w:color="DADCE0"/>
-              <w:left w:val="single" w:sz="8" w:space="0" w:color="DADCE0"/>
-              <w:bottom w:val="single" w:sz="8" w:space="0" w:color="DADCE0"/>
-              <w:right w:val="single" w:sz="8" w:space="0" w:color="DADCE0"/>
-            </w:tcBorders>
-          </w:tcPr>
-          <w:p>
-            <w:pPr>
-              <w:spacing w:after="0" w:line="259" w:lineRule="auto"/>
-              <w:ind w:left="5" w:firstLine="0"/>
-            </w:pPr>
-            <w:r>
-              <w:rPr>
-                <w:sz w:val="18"/>
-              </w:rPr>
-              <w:t>0.4493</w:t>
-            </w:r>
-            <w:r/>
-          </w:p>
-        </w:tc>
-        <w:tc>
-          <w:tcPr>
-            <w:tcW w:w="1320" w:type="dxa"/>
-            <w:tcBorders>
-              <w:top w:val="single" w:sz="8" w:space="0" w:color="DADCE0"/>
-              <w:left w:val="single" w:sz="8" w:space="0" w:color="DADCE0"/>
-              <w:bottom w:val="single" w:sz="8" w:space="0" w:color="DADCE0"/>
-              <w:right w:val="single" w:sz="8" w:space="0" w:color="DADCE0"/>
-            </w:tcBorders>
-          </w:tcPr>
-          <w:p>
-            <w:pPr>
-              <w:spacing w:after="0" w:line="259" w:lineRule="auto"/>
-              <w:ind w:left="0" w:firstLine="0"/>
-            </w:pPr>
-            <w:r>
-              <w:rPr>
-                <w:sz w:val="18"/>
-              </w:rPr>
-              <w:t>0.3815</w:t>
-            </w:r>
-            <w:r/>
-          </w:p>
-        </w:tc>
-        <w:tc>
-          <w:tcPr>
-            <w:tcW w:w="1340" w:type="dxa"/>
-            <w:tcBorders>
-              <w:top w:val="single" w:sz="8" w:space="0" w:color="DADCE0"/>
-              <w:left w:val="single" w:sz="8" w:space="0" w:color="DADCE0"/>
-              <w:bottom w:val="single" w:sz="8" w:space="0" w:color="DADCE0"/>
-              <w:right w:val="single" w:sz="8" w:space="0" w:color="DADCE0"/>
-            </w:tcBorders>
-          </w:tcPr>
-          <w:p>
-            <w:pPr>
-              <w:spacing w:after="0" w:line="259" w:lineRule="auto"/>
-              <w:ind w:left="15" w:firstLine="0"/>
-            </w:pPr>
-            <w:r>
-              <w:rPr>
-                <w:sz w:val="18"/>
-              </w:rPr>
-              <w:t>0.2468</w:t>
-            </w:r>
-            <w:r/>
-          </w:p>
-        </w:tc>
-        <w:tc>
-          <w:tcPr>
-            <w:tcW w:w="1340" w:type="dxa"/>
-            <w:tcBorders>
-              <w:top w:val="single" w:sz="8" w:space="0" w:color="DADCE0"/>
-              <w:left w:val="single" w:sz="8" w:space="0" w:color="DADCE0"/>
-              <w:bottom w:val="single" w:sz="8" w:space="0" w:color="DADCE0"/>
-              <w:right w:val="single" w:sz="8" w:space="0" w:color="DADCE0"/>
-            </w:tcBorders>
-          </w:tcPr>
-          <w:p>
-            <w:pPr>
-              <w:spacing w:after="0" w:line="259" w:lineRule="auto"/>
-              <w:ind w:firstLine="0"/>
-            </w:pPr>
-            <w:r>
-              <w:rPr>
-                <w:sz w:val="18"/>
-              </w:rPr>
-              <w:t>0.4396</w:t>
+              <w:t>0.2481</w:t>
             </w:r>
             <w:r/>
           </w:p>
@@ -3964,7 +3434,7 @@
     <w:p>
       <w:pPr/>
       <w:r>
-        <w:t>*The USD final holdouts contained only Low-risk observations: 324 rows for 7 days and 323 rows for 14 days. Their 100% accuracy shows correct classification of that stable period, but it does not prove that the models distinguish all three risk classes.</w:t>
+        <w:t>*The final USD flexible-horizon holdout contains only Low-risk labels. Its 100% accuracy is not evidence that the model distinguishes all three classes.</w:t>
       </w:r>
     </w:p>
     <w:p>
@@ -3978,7 +3448,7 @@
     <w:p>
       <w:pPr/>
       <w:r>
-        <w:t>All 26 automated software tests passed. They covered official BNR data validation, multicurrency API responses and predictions, Excel report generation, model output labels, forward-only backtest folds, purge gaps, final-holdout isolation, frontend structure, and account security foundations. Passing these tests shows that the tested software behaves as designed; it does not replace security auditing, legal review, production monitoring, or future model validation.</w:t>
+        <w:t>All 42 automated software tests passed. They cover the application, data validation, 1-to-100-day feature construction, payment-date limits, model outputs, reliability gate, forward-only evaluation, API, frontend, and account security foundations.</w:t>
       </w:r>
     </w:p>
     <w:p>
@@ -3992,7 +3462,7 @@
     <w:p>
       <w:pPr/>
       <w:r>
-        <w:t>The testing provides a more realistic assessment than the earlier single USD holdout. USD/RWF showed moderate historical signal, while EUR/RWF and KES/RWF remained close to the three-class reference level. FXGuard AI should therefore be described as a functioning and transparent experimental decision-support prototype, not as a guaranteed financial forecasting tool.</w:t>
+        <w:t>None of the three flexible classifiers passed the declared reliability gate. The software is a functioning experimental prototype, but the current evidence does not support operational financial reliance.</w:t>
       </w:r>
     </w:p>
     <w:p>
@@ -4019,7 +3489,7 @@
         <w:ind w:left="-5"/>
       </w:pPr>
       <w:r>
-        <w:t>Logistic Regression was selected for five of the six currency/horizon tasks. Random Forest was selected for EUR/RWF over 7 days. Selection used mean rolling balanced accuracy, followed by Macro F1 and accuracy; final holdout performance did not influence the choice.</w:t>
+        <w:t>Logistic Regression was selected for USD, XGBoost for EUR, and Random Forest for KES. Selection used mean rolling balanced accuracy, then Macro F1 and accuracy.</w:t>
       </w:r>
       <w:r/>
       <w:r/>
@@ -4033,7 +3503,7 @@
         <w:ind w:hanging="360"/>
       </w:pPr>
       <w:r>
-        <w:t>USD/RWF produced the strongest historical result, with 7-day balanced accuracy of 0.5173. This indicates some useful historical signal, but not enough to treat individual predictions as certain.</w:t>
+        <w:t>Pooled rolling balanced accuracy was 0.4472 for USD, 0.2987 for EUR, and 0.4016 for KES. Macro F1 was also below the declared gate for all three.</w:t>
       </w:r>
     </w:p>
     <w:p>
@@ -4057,7 +3527,7 @@
         <w:ind w:hanging="360"/>
       </w:pPr>
       <w:r>
-        <w:t>XGBoost was not selected for any task. Greater algorithm complexity therefore did not overcome the main challenge of finding stable short-term patterns in the available exchange-rate history.</w:t>
+        <w:t>More complex algorithms did not reliably overcome the limited predictive signal in rate-history features. Algorithm choice alone is therefore not the main solution to the reliability problem.</w:t>
       </w:r>
     </w:p>
     <w:p>
@@ -4070,7 +3540,7 @@
         <w:ind w:hanging="360"/>
       </w:pPr>
       <w:r>
-        <w:t>The results support an experimental decision-support prototype rather than a guaranteed forecasting system. Predictions should be considered alongside the user's business context and other financial information.</w:t>
+        <w:t>The pre-declared project gate requires mean balanced accuracy of at least 0.55, mean Macro F1 of at least 0.45, and at least 0.05 improvement over the baseline. All current models remain experimental.</w:t>
       </w:r>
       <w:r/>
     </w:p>
@@ -4080,7 +3550,7 @@
         <w:ind w:left="374" w:hanging="389"/>
       </w:pPr>
       <w:r>
-        <w:t xml:space="preserve">Probability Prediction and Confidence Score </w:t>
+        <w:t>Uncalibrated Model Score</w:t>
       </w:r>
     </w:p>
     <w:p>
@@ -4088,11 +3558,9 @@
         <w:ind w:left="-5"/>
       </w:pPr>
       <w:r>
-        <w:t>The model does not only return a class label. It also returns class probabilities for Low, Medium, and High risk. The confi</w:t>
-      </w:r>
-      <w:r>
-        <w:t xml:space="preserve">dence score is attached to the prediction by taking the probability assigned to the predicted top class. </w:t>
-      </w:r>
+        <w:t>The classifier returns relative scores for Low, Medium, and High. The largest score accompanies the selected class, but it has not been shown to equal the real-world frequency of that outcome.</w:t>
+      </w:r>
+      <w:r/>
     </w:p>
     <w:tbl>
       <w:tblPr>
@@ -4138,9 +3606,7 @@
               </w:rPr>
               <w:t>Item</w:t>
             </w:r>
-            <w:r>
-              <w:t xml:space="preserve"> </w:t>
-            </w:r>
+            <w:r/>
           </w:p>
         </w:tc>
         <w:tc>
@@ -4166,9 +3632,7 @@
               </w:rPr>
               <w:t>Description</w:t>
             </w:r>
-            <w:r>
-              <w:t xml:space="preserve"> </w:t>
-            </w:r>
+            <w:r/>
           </w:p>
         </w:tc>
       </w:tr>
@@ -4195,11 +3659,9 @@
               <w:rPr>
                 <w:sz w:val="18"/>
               </w:rPr>
-              <w:t>Probability output</w:t>
-            </w:r>
-            <w:r>
-              <w:t xml:space="preserve"> </w:t>
-            </w:r>
+              <w:t>Model-score output</w:t>
+            </w:r>
+            <w:r/>
           </w:p>
         </w:tc>
         <w:tc>
@@ -4221,11 +3683,9 @@
               <w:rPr>
                 <w:sz w:val="18"/>
               </w:rPr>
-              <w:t>Example: Low = 0.92, Medium = 0.06, High = 0.02.</w:t>
-            </w:r>
-            <w:r>
-              <w:t xml:space="preserve"> </w:t>
-            </w:r>
+              <w:t>Example display: ≈ 92% for the selected class.</w:t>
+            </w:r>
+            <w:r/>
           </w:p>
         </w:tc>
       </w:tr>
@@ -4253,11 +3713,9 @@
               <w:rPr>
                 <w:sz w:val="18"/>
               </w:rPr>
-              <w:t>Predicted class</w:t>
-            </w:r>
-            <w:r>
-              <w:t xml:space="preserve"> </w:t>
-            </w:r>
+              <w:t>Selected class</w:t>
+            </w:r>
+            <w:r/>
           </w:p>
         </w:tc>
         <w:tc>
@@ -4279,17 +3737,14 @@
               <w:rPr>
                 <w:sz w:val="18"/>
               </w:rPr>
-              <w:t xml:space="preserve">The class with the highest probability, </w:t>
-            </w:r>
-            <w:r>
-              <w:rPr>
-                <w:sz w:val="18"/>
-              </w:rPr>
-              <w:t>for example Low.</w:t>
-            </w:r>
-            <w:r>
-              <w:t xml:space="preserve"> </w:t>
-            </w:r>
+              <w:t>The class with the largest model score.</w:t>
+            </w:r>
+            <w:r>
+              <w:rPr>
+                <w:sz w:val="18"/>
+              </w:rPr>
+            </w:r>
+            <w:r/>
           </w:p>
         </w:tc>
       </w:tr>
@@ -4317,11 +3772,9 @@
               <w:rPr>
                 <w:sz w:val="18"/>
               </w:rPr>
-              <w:t>Confidence score</w:t>
-            </w:r>
-            <w:r>
-              <w:t xml:space="preserve"> </w:t>
-            </w:r>
+              <w:t>Top model score</w:t>
+            </w:r>
+            <w:r/>
           </w:p>
         </w:tc>
         <w:tc>
@@ -4343,11 +3796,9 @@
               <w:rPr>
                 <w:sz w:val="18"/>
               </w:rPr>
-              <w:t>The probability of the predicted top class, for example 92%.</w:t>
-            </w:r>
-            <w:r>
-              <w:t xml:space="preserve"> </w:t>
-            </w:r>
+              <w:t>An uncalibrated relative score, not a verified outcome probability.</w:t>
+            </w:r>
+            <w:r/>
           </w:p>
         </w:tc>
       </w:tr>
@@ -4377,9 +3828,7 @@
               </w:rPr>
               <w:t>Why it matters</w:t>
             </w:r>
-            <w:r>
-              <w:t xml:space="preserve"> </w:t>
-            </w:r>
+            <w:r/>
           </w:p>
         </w:tc>
         <w:tc>
@@ -4401,11 +3850,9 @@
               <w:rPr>
                 <w:sz w:val="18"/>
               </w:rPr>
-              <w:t>It helps the user see whether the model is confident or whether the case is borderline.</w:t>
-            </w:r>
-            <w:r>
-              <w:t xml:space="preserve"> </w:t>
-            </w:r>
+              <w:t>It exposes how strongly the model favors one class while retaining an explicit reliability warning.</w:t>
+            </w:r>
+            <w:r/>
           </w:p>
         </w:tc>
       </w:tr>
@@ -4416,7 +3863,7 @@
         <w:ind w:left="-5"/>
       </w:pPr>
       <w:r>
-        <w:t>For example, if a selected foreign-currency payment receives Low risk with 92% model confidence, the application displays Low and the full probability distribution. This is more transparent than displaying only a single label, but the score is not a guaranteed real-world probability.</w:t>
+        <w:t>The interface therefore labels this value an uncalibrated model score, not a likelihood probability or confidence guarantee.</w:t>
       </w:r>
       <w:r/>
     </w:p>
@@ -4463,7 +3910,7 @@
         <w:ind w:hanging="360"/>
       </w:pPr>
       <w:r>
-        <w:t xml:space="preserve">The user selects a 7-day or 14-day horizon. </w:t>
+        <w:t>The user selects the expected invoice payment date. The browser accepts tomorrow through 100 days ahead, and the API independently enforces the same limit using the current Rwanda date.</w:t>
       </w:r>
     </w:p>
     <w:p>
@@ -4487,11 +3934,9 @@
         <w:ind w:hanging="360"/>
       </w:pPr>
       <w:r>
-        <w:t xml:space="preserve">The backend loads the latest </w:t>
-      </w:r>
-      <w:r>
-        <w:t xml:space="preserve">feature row and selected trained model. </w:t>
-      </w:r>
+        <w:t>The backend calculates the number of calendar days until payment, loads the selected currency's flexible model, and supplies horizon_days with the latest official-posting features.</w:t>
+      </w:r>
+      <w:r/>
     </w:p>
     <w:p>
       <w:pPr>
@@ -4502,7 +3947,7 @@
         <w:ind w:hanging="360"/>
       </w:pPr>
       <w:r>
-        <w:t xml:space="preserve">The model returns a risk class, probabilities, and confidence score. </w:t>
+        <w:t>The model returns a risk class and uncalibrated class scores. The interface prefixes the leading score with an approximation sign, such as ≈ 72%, and shows that the model is experimental.</w:t>
       </w:r>
     </w:p>
     <w:p>
@@ -4788,11 +4233,9 @@
               <w:rPr>
                 <w:sz w:val="18"/>
               </w:rPr>
-              <w:t>Assumption 3</w:t>
-            </w:r>
-            <w:r>
-              <w:t xml:space="preserve"> </w:t>
-            </w:r>
+              <w:t>Preprocessing decision</w:t>
+            </w:r>
+            <w:r/>
           </w:p>
         </w:tc>
         <w:tc>
@@ -4815,11 +4258,9 @@
               <w:rPr>
                 <w:sz w:val="18"/>
               </w:rPr>
-              <w:t>Forward-filled non-posting days are acceptable for creating a continuous daily calendar.</w:t>
-            </w:r>
-            <w:r>
-              <w:t xml:space="preserve"> </w:t>
-            </w:r>
+              <w:t>Model training excludes forward-filled non-posting dates; the daily calendar is display-only.</w:t>
+            </w:r>
+            <w:r/>
           </w:p>
         </w:tc>
       </w:tr>
@@ -4930,7 +4371,7 @@
               <w:rPr>
                 <w:sz w:val="18"/>
               </w:rPr>
-              <w:t>Backtest performance is mixed, and the final USD holdout contains only the Low class.</w:t>
+              <w:t>No current classifier passes the project-defined reliability gate; final USD holdouts also contain only Low risk.</w:t>
             </w:r>
             <w:r>
               <w:rPr>
@@ -5049,7 +4490,7 @@
               <w:rPr>
                 <w:sz w:val="18"/>
               </w:rPr>
-              <w:t>Add macroeconomic features, live outcome monitoring, probability calibration, more currencies, scheduled data refresh, and repeated future validation.</w:t>
+              <w:t>Test publication-lagged macro features, collect new outcomes, calibrate scores, and test importer comprehension directly.</w:t>
             </w:r>
             <w:r>
               <w:rPr>
@@ -5183,6 +4624,24 @@
       </w:pPr>
       <w:r>
         <w:t xml:space="preserve"> </w:t>
+      </w:r>
+    </w:p>
+    <w:p>
+      <w:pPr>
+        <w:pStyle w:val="Heading1"/>
+      </w:pPr>
+      <w:r>
+        <w:t>Defense Panel Response Addendum</w:t>
+      </w:r>
+    </w:p>
+    <w:p>
+      <w:r>
+        <w:t>The revised problem statement does not claim that importers universally cannot interpret exchange-rate data. Available Rwanda-specific literature supports foreign-exchange exposure and constrained firm capacity, but not that stronger importer-specific interpretation claim. Importer comprehension will be tested empirically in future user research.</w:t>
+      </w:r>
+    </w:p>
+    <w:p>
+      <w:r>
+        <w:t>Future macro-feature experiments will use inflation, policy, fuel/commodity, and trade variables only after their real publication dates. Low-frequency values may be carried forward with an age indicator, but never backfilled into dates when they were not yet public.</w:t>
       </w:r>
     </w:p>
     <w:sectPr>

</xml_diff>